<commit_message>
Document the Script Runner playbooks in the guide and README
Customer guide: new section 10 covering the three-playbook architecture,
the Koi Script Runner List schema (full field table + example), how
scripts are matched to endpoints by OS at dispatch time, job setup, and
the three-state run outcomes; later sections renumbered 11-15.

README: compact Script Runner section with the same architecture table,
config example, and outcome semantics.

Co-Authored-By: Claude Fable 5 <noreply@anthropic.com>
</commit_message>
<xml_diff>
--- a/docs/KOI_Integration_Customer_Guide_v1.3.0.docx
+++ b/docs/KOI_Integration_Customer_Guide_v1.3.0.docx
@@ -836,6 +836,67 @@
                 <w:szCs w:val="20"/>
               </w:rPr>
               <w:t xml:space="preserve">Ready-made XSIAM dashboard visualizing KOI alert activity.</w:t>
+            </w:r>
+          </w:p>
+        </w:tc>
+      </w:tr>
+      <w:tr>
+        <w:trPr>
+          <w:tblHeader w:val="false"/>
+        </w:trPr>
+        <w:tc>
+          <w:tcPr>
+            <w:tcW w:type="dxa" w:w="3000"/>
+            <w:tcMar>
+              <w:top w:type="dxa" w:w="60"/>
+              <w:left w:type="dxa" w:w="100"/>
+              <w:bottom w:type="dxa" w:w="60"/>
+              <w:right w:type="dxa" w:w="100"/>
+            </w:tcMar>
+            <w:vAlign w:val="center"/>
+          </w:tcPr>
+          <w:p>
+            <w:pPr>
+              <w:spacing w:after="0"/>
+            </w:pPr>
+            <w:r>
+              <w:rPr>
+                <w:rFonts w:ascii="Calibri" w:cs="Calibri" w:eastAsia="Calibri" w:hAnsi="Calibri"/>
+                <w:b w:val="false"/>
+                <w:bCs w:val="false"/>
+                <w:color w:val="1F2937"/>
+                <w:sz w:val="20"/>
+                <w:szCs w:val="20"/>
+              </w:rPr>
+              <w:t xml:space="preserve">Koi Unified Script Runner playbooks</w:t>
+            </w:r>
+          </w:p>
+        </w:tc>
+        <w:tc>
+          <w:tcPr>
+            <w:tcW w:type="dxa" w:w="6360"/>
+            <w:tcMar>
+              <w:top w:type="dxa" w:w="60"/>
+              <w:left w:type="dxa" w:w="100"/>
+              <w:bottom w:type="dxa" w:w="60"/>
+              <w:right w:type="dxa" w:w="100"/>
+            </w:tcMar>
+            <w:vAlign w:val="center"/>
+          </w:tcPr>
+          <w:p>
+            <w:pPr>
+              <w:spacing w:after="0"/>
+            </w:pPr>
+            <w:r>
+              <w:rPr>
+                <w:rFonts w:ascii="Calibri" w:cs="Calibri" w:eastAsia="Calibri" w:hAnsi="Calibri"/>
+                <w:b w:val="false"/>
+                <w:bCs w:val="false"/>
+                <w:color w:val="1F2937"/>
+                <w:sz w:val="20"/>
+                <w:szCs w:val="20"/>
+              </w:rPr>
+              <w:t xml:space="preserve">Three playbooks that run KOI script packages on Cortex-Agent endpoints on a schedule, driven by a Job and configured through a JSON List (section 10).</w:t>
             </w:r>
           </w:p>
         </w:tc>
@@ -5189,7 +5250,7 @@
           <w:sz w:val="32"/>
           <w:szCs w:val="32"/>
         </w:rPr>
-        <w:t xml:space="preserve">10. Deploying the Full Pack as a Single Object (demisto-sdk)</w:t>
+        <w:t xml:space="preserve">10. Koi Unified Script Runner Playbooks</w:t>
       </w:r>
     </w:p>
     <w:p>
@@ -5203,7 +5264,7 @@
           <w:sz w:val="22"/>
           <w:szCs w:val="22"/>
         </w:rPr>
-        <w:t xml:space="preserve">The pack can be delivered to a tenant as one artifact — a pack zip — using Palo Alto Networks' demisto-sdk. This is the recommended path for dev/test tenants and CI pipelines; production tenants normally install from the Marketplace.</w:t>
+        <w:t xml:space="preserve">These three playbooks run KOI script packages (for example, the KOI deployment script) on Cortex-Agent endpoints on a recurring schedule. They are designed to be attached to a time-triggered Job and are configured entirely through a JSON List — retargeting or adding scripts never requires editing a playbook.</w:t>
       </w:r>
     </w:p>
     <w:p>
@@ -5220,7 +5281,1589 @@
           <w:sz w:val="26"/>
           <w:szCs w:val="26"/>
         </w:rPr>
-        <w:t xml:space="preserve">10.1 One-time setup</w:t>
+        <w:t xml:space="preserve">10.1 Architecture</w:t>
+      </w:r>
+    </w:p>
+    <w:tbl>
+      <w:tblPr>
+        <w:tblW w:type="dxa" w:w="9360"/>
+        <w:tblBorders>
+          <w:top w:val="single" w:color="auto" w:sz="4"/>
+          <w:left w:val="single" w:color="auto" w:sz="4"/>
+          <w:bottom w:val="single" w:color="auto" w:sz="4"/>
+          <w:right w:val="single" w:color="auto" w:sz="4"/>
+          <w:insideH w:val="single" w:color="auto" w:sz="4"/>
+          <w:insideV w:val="single" w:color="auto" w:sz="4"/>
+        </w:tblBorders>
+      </w:tblPr>
+      <w:tblGrid>
+        <w:gridCol w:w="3400"/>
+        <w:gridCol w:w="5960"/>
+      </w:tblGrid>
+      <w:tr>
+        <w:trPr>
+          <w:tblHeader/>
+        </w:trPr>
+        <w:tc>
+          <w:tcPr>
+            <w:tcW w:type="dxa" w:w="3400"/>
+            <w:shd w:fill="334155" w:val="clear"/>
+            <w:tcMar>
+              <w:top w:type="dxa" w:w="60"/>
+              <w:left w:type="dxa" w:w="100"/>
+              <w:bottom w:type="dxa" w:w="60"/>
+              <w:right w:type="dxa" w:w="100"/>
+            </w:tcMar>
+            <w:vAlign w:val="center"/>
+          </w:tcPr>
+          <w:p>
+            <w:pPr>
+              <w:spacing w:after="0"/>
+            </w:pPr>
+            <w:r>
+              <w:rPr>
+                <w:rFonts w:ascii="Calibri" w:cs="Calibri" w:eastAsia="Calibri" w:hAnsi="Calibri"/>
+                <w:b/>
+                <w:bCs/>
+                <w:color w:val="FFFFFF"/>
+                <w:sz w:val="21"/>
+                <w:szCs w:val="21"/>
+              </w:rPr>
+              <w:t xml:space="preserve">Playbook</w:t>
+            </w:r>
+          </w:p>
+        </w:tc>
+        <w:tc>
+          <w:tcPr>
+            <w:tcW w:type="dxa" w:w="5960"/>
+            <w:shd w:fill="334155" w:val="clear"/>
+            <w:tcMar>
+              <w:top w:type="dxa" w:w="60"/>
+              <w:left w:type="dxa" w:w="100"/>
+              <w:bottom w:type="dxa" w:w="60"/>
+              <w:right w:type="dxa" w:w="100"/>
+            </w:tcMar>
+            <w:vAlign w:val="center"/>
+          </w:tcPr>
+          <w:p>
+            <w:pPr>
+              <w:spacing w:after="0"/>
+            </w:pPr>
+            <w:r>
+              <w:rPr>
+                <w:rFonts w:ascii="Calibri" w:cs="Calibri" w:eastAsia="Calibri" w:hAnsi="Calibri"/>
+                <w:b/>
+                <w:bCs/>
+                <w:color w:val="FFFFFF"/>
+                <w:sz w:val="21"/>
+                <w:szCs w:val="21"/>
+              </w:rPr>
+              <w:t xml:space="preserve">Role</w:t>
+            </w:r>
+          </w:p>
+        </w:tc>
+      </w:tr>
+      <w:tr>
+        <w:trPr>
+          <w:tblHeader w:val="false"/>
+        </w:trPr>
+        <w:tc>
+          <w:tcPr>
+            <w:tcW w:type="dxa" w:w="3400"/>
+            <w:tcMar>
+              <w:top w:type="dxa" w:w="60"/>
+              <w:left w:type="dxa" w:w="100"/>
+              <w:bottom w:type="dxa" w:w="60"/>
+              <w:right w:type="dxa" w:w="100"/>
+            </w:tcMar>
+            <w:vAlign w:val="center"/>
+          </w:tcPr>
+          <w:p>
+            <w:pPr>
+              <w:spacing w:after="0"/>
+            </w:pPr>
+            <w:r>
+              <w:rPr>
+                <w:rFonts w:ascii="Calibri" w:cs="Calibri" w:eastAsia="Calibri" w:hAnsi="Calibri"/>
+                <w:b w:val="false"/>
+                <w:bCs w:val="false"/>
+                <w:color w:val="1F2937"/>
+                <w:sz w:val="20"/>
+                <w:szCs w:val="20"/>
+              </w:rPr>
+              <w:t xml:space="preserve">Koi Unified - Script Runner</w:t>
+            </w:r>
+          </w:p>
+        </w:tc>
+        <w:tc>
+          <w:tcPr>
+            <w:tcW w:type="dxa" w:w="5960"/>
+            <w:tcMar>
+              <w:top w:type="dxa" w:w="60"/>
+              <w:left w:type="dxa" w:w="100"/>
+              <w:bottom w:type="dxa" w:w="60"/>
+              <w:right w:type="dxa" w:w="100"/>
+            </w:tcMar>
+            <w:vAlign w:val="center"/>
+          </w:tcPr>
+          <w:p>
+            <w:pPr>
+              <w:spacing w:after="0"/>
+            </w:pPr>
+            <w:r>
+              <w:rPr>
+                <w:rFonts w:ascii="Calibri" w:cs="Calibri" w:eastAsia="Calibri" w:hAnsi="Calibri"/>
+                <w:b w:val="false"/>
+                <w:bCs w:val="false"/>
+                <w:color w:val="1F2937"/>
+                <w:sz w:val="20"/>
+                <w:szCs w:val="20"/>
+              </w:rPr>
+              <w:t xml:space="preserve">Job entry point. Loads the "Koi Script Runner" List and loops over its entries — one iteration per entry, each in an isolated context. Closes its own investigation when done.</w:t>
+            </w:r>
+          </w:p>
+        </w:tc>
+      </w:tr>
+      <w:tr>
+        <w:trPr>
+          <w:tblHeader w:val="false"/>
+        </w:trPr>
+        <w:tc>
+          <w:tcPr>
+            <w:tcW w:type="dxa" w:w="3400"/>
+            <w:tcMar>
+              <w:top w:type="dxa" w:w="60"/>
+              <w:left w:type="dxa" w:w="100"/>
+              <w:bottom w:type="dxa" w:w="60"/>
+              <w:right w:type="dxa" w:w="100"/>
+            </w:tcMar>
+            <w:vAlign w:val="center"/>
+          </w:tcPr>
+          <w:p>
+            <w:pPr>
+              <w:spacing w:after="0"/>
+            </w:pPr>
+            <w:r>
+              <w:rPr>
+                <w:rFonts w:ascii="Calibri" w:cs="Calibri" w:eastAsia="Calibri" w:hAnsi="Calibri"/>
+                <w:b w:val="false"/>
+                <w:bCs w:val="false"/>
+                <w:color w:val="1F2937"/>
+                <w:sz w:val="20"/>
+                <w:szCs w:val="20"/>
+              </w:rPr>
+              <w:t xml:space="preserve">Koi Unified - Process Config Entry</w:t>
+            </w:r>
+          </w:p>
+        </w:tc>
+        <w:tc>
+          <w:tcPr>
+            <w:tcW w:type="dxa" w:w="5960"/>
+            <w:tcMar>
+              <w:top w:type="dxa" w:w="60"/>
+              <w:left w:type="dxa" w:w="100"/>
+              <w:bottom w:type="dxa" w:w="60"/>
+              <w:right w:type="dxa" w:w="100"/>
+            </w:tcMar>
+            <w:vAlign w:val="center"/>
+          </w:tcPr>
+          <w:p>
+            <w:pPr>
+              <w:spacing w:after="0"/>
+            </w:pPr>
+            <w:r>
+              <w:rPr>
+                <w:rFonts w:ascii="Calibri" w:cs="Calibri" w:eastAsia="Calibri" w:hAnsi="Calibri"/>
+                <w:b w:val="false"/>
+                <w:bCs w:val="false"/>
+                <w:color w:val="1F2937"/>
+                <w:sz w:val="20"/>
+                <w:szCs w:val="20"/>
+              </w:rPr>
+              <w:t xml:space="preserve">Per-entry logic: honors the disabled flag, validates the entry (invalid entries are reported in the war room, never silently dropped), invokes the executor, routes the outcome, sends the optional email notification, and cleans up.</w:t>
+            </w:r>
+          </w:p>
+        </w:tc>
+      </w:tr>
+      <w:tr>
+        <w:trPr>
+          <w:tblHeader w:val="false"/>
+        </w:trPr>
+        <w:tc>
+          <w:tcPr>
+            <w:tcW w:type="dxa" w:w="3400"/>
+            <w:tcMar>
+              <w:top w:type="dxa" w:w="60"/>
+              <w:left w:type="dxa" w:w="100"/>
+              <w:bottom w:type="dxa" w:w="60"/>
+              <w:right w:type="dxa" w:w="100"/>
+            </w:tcMar>
+            <w:vAlign w:val="center"/>
+          </w:tcPr>
+          <w:p>
+            <w:pPr>
+              <w:spacing w:after="0"/>
+            </w:pPr>
+            <w:r>
+              <w:rPr>
+                <w:rFonts w:ascii="Calibri" w:cs="Calibri" w:eastAsia="Calibri" w:hAnsi="Calibri"/>
+                <w:b w:val="false"/>
+                <w:bCs w:val="false"/>
+                <w:color w:val="1F2937"/>
+                <w:sz w:val="20"/>
+                <w:szCs w:val="20"/>
+              </w:rPr>
+              <w:t xml:space="preserve">Koi Unified - Execute Endpoint Script</w:t>
+            </w:r>
+          </w:p>
+        </w:tc>
+        <w:tc>
+          <w:tcPr>
+            <w:tcW w:type="dxa" w:w="5960"/>
+            <w:tcMar>
+              <w:top w:type="dxa" w:w="60"/>
+              <w:left w:type="dxa" w:w="100"/>
+              <w:bottom w:type="dxa" w:w="60"/>
+              <w:right w:type="dxa" w:w="100"/>
+            </w:tcMar>
+            <w:vAlign w:val="center"/>
+          </w:tcPr>
+          <w:p>
+            <w:pPr>
+              <w:spacing w:after="0"/>
+            </w:pPr>
+            <w:r>
+              <w:rPr>
+                <w:rFonts w:ascii="Calibri" w:cs="Calibri" w:eastAsia="Calibri" w:hAnsi="Calibri"/>
+                <w:b w:val="false"/>
+                <w:bCs w:val="false"/>
+                <w:color w:val="1F2937"/>
+                <w:sz w:val="20"/>
+                <w:szCs w:val="20"/>
+              </w:rPr>
+              <w:t xml:space="preserve">Resolves the script name to its Action Center UUID (or uses a provided UUID), targets connected and unisolated endpoints filtered by OS, groups, and hostnames, executes the script with polling, and returns a structured ScriptResult.</w:t>
+            </w:r>
+          </w:p>
+        </w:tc>
+      </w:tr>
+    </w:tbl>
+    <w:p>
+      <w:pPr>
+        <w:pStyle w:val="Heading2"/>
+        <w:spacing w:after="120" w:before="280"/>
+      </w:pPr>
+      <w:r>
+        <w:rPr>
+          <w:rFonts w:ascii="Calibri" w:cs="Calibri" w:eastAsia="Calibri" w:hAnsi="Calibri"/>
+          <w:b/>
+          <w:bCs/>
+          <w:color w:val="1F2937"/>
+          <w:sz w:val="26"/>
+          <w:szCs w:val="26"/>
+        </w:rPr>
+        <w:t xml:space="preserve">10.2 Configuration — the "Koi Script Runner" List</w:t>
+      </w:r>
+    </w:p>
+    <w:p>
+      <w:pPr>
+        <w:spacing w:after="120"/>
+      </w:pPr>
+      <w:r>
+        <w:rPr>
+          <w:rFonts w:ascii="Calibri" w:cs="Calibri" w:eastAsia="Calibri" w:hAnsi="Calibri"/>
+          <w:color w:val="1F2937"/>
+          <w:sz w:val="22"/>
+          <w:szCs w:val="22"/>
+        </w:rPr>
+        <w:t xml:space="preserve">Create a JSON List named exactly "Koi Script Runner" (Settings → Configurations → Object Setup → Lists) containing an array of entries:</w:t>
+      </w:r>
+    </w:p>
+    <w:p>
+      <w:pPr>
+        <w:shd w:fill="F3F4F6" w:val="clear"/>
+        <w:spacing w:after="60"/>
+        <w:ind w:left="200" w:right="200"/>
+      </w:pPr>
+      <w:r>
+        <w:rPr>
+          <w:rFonts w:ascii="Consolas" w:cs="Consolas" w:eastAsia="Consolas" w:hAnsi="Consolas"/>
+          <w:color w:val="111827"/>
+          <w:sz w:val="19"/>
+          <w:szCs w:val="19"/>
+        </w:rPr>
+        <w:t xml:space="preserve">[</w:t>
+      </w:r>
+    </w:p>
+    <w:p>
+      <w:pPr>
+        <w:shd w:fill="F3F4F6" w:val="clear"/>
+        <w:spacing w:after="60"/>
+        <w:ind w:left="200" w:right="200"/>
+      </w:pPr>
+      <w:r>
+        <w:rPr>
+          <w:rFonts w:ascii="Consolas" w:cs="Consolas" w:eastAsia="Consolas" w:hAnsi="Consolas"/>
+          <w:color w:val="111827"/>
+          <w:sz w:val="19"/>
+          <w:szCs w:val="19"/>
+        </w:rPr>
+        <w:t xml:space="preserve">  {</w:t>
+      </w:r>
+    </w:p>
+    <w:p>
+      <w:pPr>
+        <w:shd w:fill="F3F4F6" w:val="clear"/>
+        <w:spacing w:after="60"/>
+        <w:ind w:left="200" w:right="200"/>
+      </w:pPr>
+      <w:r>
+        <w:rPr>
+          <w:rFonts w:ascii="Consolas" w:cs="Consolas" w:eastAsia="Consolas" w:hAnsi="Consolas"/>
+          <w:color w:val="111827"/>
+          <w:sz w:val="19"/>
+          <w:szCs w:val="19"/>
+        </w:rPr>
+        <w:t xml:space="preserve">    "disabled": false,</w:t>
+      </w:r>
+    </w:p>
+    <w:p>
+      <w:pPr>
+        <w:shd w:fill="F3F4F6" w:val="clear"/>
+        <w:spacing w:after="60"/>
+        <w:ind w:left="200" w:right="200"/>
+      </w:pPr>
+      <w:r>
+        <w:rPr>
+          <w:rFonts w:ascii="Consolas" w:cs="Consolas" w:eastAsia="Consolas" w:hAnsi="Consolas"/>
+          <w:color w:val="111827"/>
+          <w:sz w:val="19"/>
+          <w:szCs w:val="19"/>
+        </w:rPr>
+        <w:t xml:space="preserve">    "script": { "name": "KOI Deployment Script - Windows" },</w:t>
+      </w:r>
+    </w:p>
+    <w:p>
+      <w:pPr>
+        <w:shd w:fill="F3F4F6" w:val="clear"/>
+        <w:spacing w:after="60"/>
+        <w:ind w:left="200" w:right="200"/>
+      </w:pPr>
+      <w:r>
+        <w:rPr>
+          <w:rFonts w:ascii="Consolas" w:cs="Consolas" w:eastAsia="Consolas" w:hAnsi="Consolas"/>
+          <w:color w:val="111827"/>
+          <w:sz w:val="19"/>
+          <w:szCs w:val="19"/>
+        </w:rPr>
+        <w:t xml:space="preserve">    "target": {</w:t>
+      </w:r>
+    </w:p>
+    <w:p>
+      <w:pPr>
+        <w:shd w:fill="F3F4F6" w:val="clear"/>
+        <w:spacing w:after="60"/>
+        <w:ind w:left="200" w:right="200"/>
+      </w:pPr>
+      <w:r>
+        <w:rPr>
+          <w:rFonts w:ascii="Consolas" w:cs="Consolas" w:eastAsia="Consolas" w:hAnsi="Consolas"/>
+          <w:color w:val="111827"/>
+          <w:sz w:val="19"/>
+          <w:szCs w:val="19"/>
+        </w:rPr>
+        <w:t xml:space="preserve">      "endpoint_groups": ["KOI Endpoints"],</w:t>
+      </w:r>
+    </w:p>
+    <w:p>
+      <w:pPr>
+        <w:shd w:fill="F3F4F6" w:val="clear"/>
+        <w:spacing w:after="60"/>
+        <w:ind w:left="200" w:right="200"/>
+      </w:pPr>
+      <w:r>
+        <w:rPr>
+          <w:rFonts w:ascii="Consolas" w:cs="Consolas" w:eastAsia="Consolas" w:hAnsi="Consolas"/>
+          <w:color w:val="111827"/>
+          <w:sz w:val="19"/>
+          <w:szCs w:val="19"/>
+        </w:rPr>
+        <w:t xml:space="preserve">      "endpoint_hostnames": [],</w:t>
+      </w:r>
+    </w:p>
+    <w:p>
+      <w:pPr>
+        <w:shd w:fill="F3F4F6" w:val="clear"/>
+        <w:spacing w:after="60"/>
+        <w:ind w:left="200" w:right="200"/>
+      </w:pPr>
+      <w:r>
+        <w:rPr>
+          <w:rFonts w:ascii="Consolas" w:cs="Consolas" w:eastAsia="Consolas" w:hAnsi="Consolas"/>
+          <w:color w:val="111827"/>
+          <w:sz w:val="19"/>
+          <w:szCs w:val="19"/>
+        </w:rPr>
+        <w:t xml:space="preserve">      "endpoint_os": "Windows"</w:t>
+      </w:r>
+    </w:p>
+    <w:p>
+      <w:pPr>
+        <w:shd w:fill="F3F4F6" w:val="clear"/>
+        <w:spacing w:after="60"/>
+        <w:ind w:left="200" w:right="200"/>
+      </w:pPr>
+      <w:r>
+        <w:rPr>
+          <w:rFonts w:ascii="Consolas" w:cs="Consolas" w:eastAsia="Consolas" w:hAnsi="Consolas"/>
+          <w:color w:val="111827"/>
+          <w:sz w:val="19"/>
+          <w:szCs w:val="19"/>
+        </w:rPr>
+        <w:t xml:space="preserve">    },</w:t>
+      </w:r>
+    </w:p>
+    <w:p>
+      <w:pPr>
+        <w:shd w:fill="F3F4F6" w:val="clear"/>
+        <w:spacing w:after="60"/>
+        <w:ind w:left="200" w:right="200"/>
+      </w:pPr>
+      <w:r>
+        <w:rPr>
+          <w:rFonts w:ascii="Consolas" w:cs="Consolas" w:eastAsia="Consolas" w:hAnsi="Consolas"/>
+          <w:color w:val="111827"/>
+          <w:sz w:val="19"/>
+          <w:szCs w:val="19"/>
+        </w:rPr>
+        <w:t xml:space="preserve">    "notification": {</w:t>
+      </w:r>
+    </w:p>
+    <w:p>
+      <w:pPr>
+        <w:shd w:fill="F3F4F6" w:val="clear"/>
+        <w:spacing w:after="60"/>
+        <w:ind w:left="200" w:right="200"/>
+      </w:pPr>
+      <w:r>
+        <w:rPr>
+          <w:rFonts w:ascii="Consolas" w:cs="Consolas" w:eastAsia="Consolas" w:hAnsi="Consolas"/>
+          <w:color w:val="111827"/>
+          <w:sz w:val="19"/>
+          <w:szCs w:val="19"/>
+        </w:rPr>
+        <w:t xml:space="preserve">      "sendmail_instance": { "name": "internal-smtp" },</w:t>
+      </w:r>
+    </w:p>
+    <w:p>
+      <w:pPr>
+        <w:shd w:fill="F3F4F6" w:val="clear"/>
+        <w:spacing w:after="60"/>
+        <w:ind w:left="200" w:right="200"/>
+      </w:pPr>
+      <w:r>
+        <w:rPr>
+          <w:rFonts w:ascii="Consolas" w:cs="Consolas" w:eastAsia="Consolas" w:hAnsi="Consolas"/>
+          <w:color w:val="111827"/>
+          <w:sz w:val="19"/>
+          <w:szCs w:val="19"/>
+        </w:rPr>
+        <w:t xml:space="preserve">      "recipients": ["ops@example.com"]</w:t>
+      </w:r>
+    </w:p>
+    <w:p>
+      <w:pPr>
+        <w:shd w:fill="F3F4F6" w:val="clear"/>
+        <w:spacing w:after="60"/>
+        <w:ind w:left="200" w:right="200"/>
+      </w:pPr>
+      <w:r>
+        <w:rPr>
+          <w:rFonts w:ascii="Consolas" w:cs="Consolas" w:eastAsia="Consolas" w:hAnsi="Consolas"/>
+          <w:color w:val="111827"/>
+          <w:sz w:val="19"/>
+          <w:szCs w:val="19"/>
+        </w:rPr>
+        <w:t xml:space="preserve">    }</w:t>
+      </w:r>
+    </w:p>
+    <w:p>
+      <w:pPr>
+        <w:shd w:fill="F3F4F6" w:val="clear"/>
+        <w:spacing w:after="60"/>
+        <w:ind w:left="200" w:right="200"/>
+      </w:pPr>
+      <w:r>
+        <w:rPr>
+          <w:rFonts w:ascii="Consolas" w:cs="Consolas" w:eastAsia="Consolas" w:hAnsi="Consolas"/>
+          <w:color w:val="111827"/>
+          <w:sz w:val="19"/>
+          <w:szCs w:val="19"/>
+        </w:rPr>
+        <w:t xml:space="preserve">  }</w:t>
+      </w:r>
+    </w:p>
+    <w:p>
+      <w:pPr>
+        <w:shd w:fill="F3F4F6" w:val="clear"/>
+        <w:spacing w:after="60"/>
+        <w:ind w:left="200" w:right="200"/>
+      </w:pPr>
+      <w:r>
+        <w:rPr>
+          <w:rFonts w:ascii="Consolas" w:cs="Consolas" w:eastAsia="Consolas" w:hAnsi="Consolas"/>
+          <w:color w:val="111827"/>
+          <w:sz w:val="19"/>
+          <w:szCs w:val="19"/>
+        </w:rPr>
+        <w:t xml:space="preserve">]</w:t>
+      </w:r>
+    </w:p>
+    <w:tbl>
+      <w:tblPr>
+        <w:tblW w:type="dxa" w:w="9360"/>
+        <w:tblBorders>
+          <w:top w:val="single" w:color="auto" w:sz="4"/>
+          <w:left w:val="single" w:color="auto" w:sz="4"/>
+          <w:bottom w:val="single" w:color="auto" w:sz="4"/>
+          <w:right w:val="single" w:color="auto" w:sz="4"/>
+          <w:insideH w:val="single" w:color="auto" w:sz="4"/>
+          <w:insideV w:val="single" w:color="auto" w:sz="4"/>
+        </w:tblBorders>
+      </w:tblPr>
+      <w:tblGrid>
+        <w:gridCol w:w="3300"/>
+        <w:gridCol w:w="1300"/>
+        <w:gridCol w:w="4760"/>
+      </w:tblGrid>
+      <w:tr>
+        <w:trPr>
+          <w:tblHeader/>
+        </w:trPr>
+        <w:tc>
+          <w:tcPr>
+            <w:tcW w:type="dxa" w:w="3300"/>
+            <w:shd w:fill="334155" w:val="clear"/>
+            <w:tcMar>
+              <w:top w:type="dxa" w:w="60"/>
+              <w:left w:type="dxa" w:w="100"/>
+              <w:bottom w:type="dxa" w:w="60"/>
+              <w:right w:type="dxa" w:w="100"/>
+            </w:tcMar>
+            <w:vAlign w:val="center"/>
+          </w:tcPr>
+          <w:p>
+            <w:pPr>
+              <w:spacing w:after="0"/>
+            </w:pPr>
+            <w:r>
+              <w:rPr>
+                <w:rFonts w:ascii="Calibri" w:cs="Calibri" w:eastAsia="Calibri" w:hAnsi="Calibri"/>
+                <w:b/>
+                <w:bCs/>
+                <w:color w:val="FFFFFF"/>
+                <w:sz w:val="21"/>
+                <w:szCs w:val="21"/>
+              </w:rPr>
+              <w:t xml:space="preserve">Field</w:t>
+            </w:r>
+          </w:p>
+        </w:tc>
+        <w:tc>
+          <w:tcPr>
+            <w:tcW w:type="dxa" w:w="1300"/>
+            <w:shd w:fill="334155" w:val="clear"/>
+            <w:tcMar>
+              <w:top w:type="dxa" w:w="60"/>
+              <w:left w:type="dxa" w:w="100"/>
+              <w:bottom w:type="dxa" w:w="60"/>
+              <w:right w:type="dxa" w:w="100"/>
+            </w:tcMar>
+            <w:vAlign w:val="center"/>
+          </w:tcPr>
+          <w:p>
+            <w:pPr>
+              <w:spacing w:after="0"/>
+            </w:pPr>
+            <w:r>
+              <w:rPr>
+                <w:rFonts w:ascii="Calibri" w:cs="Calibri" w:eastAsia="Calibri" w:hAnsi="Calibri"/>
+                <w:b/>
+                <w:bCs/>
+                <w:color w:val="FFFFFF"/>
+                <w:sz w:val="21"/>
+                <w:szCs w:val="21"/>
+              </w:rPr>
+              <w:t xml:space="preserve">Required</w:t>
+            </w:r>
+          </w:p>
+        </w:tc>
+        <w:tc>
+          <w:tcPr>
+            <w:tcW w:type="dxa" w:w="4760"/>
+            <w:shd w:fill="334155" w:val="clear"/>
+            <w:tcMar>
+              <w:top w:type="dxa" w:w="60"/>
+              <w:left w:type="dxa" w:w="100"/>
+              <w:bottom w:type="dxa" w:w="60"/>
+              <w:right w:type="dxa" w:w="100"/>
+            </w:tcMar>
+            <w:vAlign w:val="center"/>
+          </w:tcPr>
+          <w:p>
+            <w:pPr>
+              <w:spacing w:after="0"/>
+            </w:pPr>
+            <w:r>
+              <w:rPr>
+                <w:rFonts w:ascii="Calibri" w:cs="Calibri" w:eastAsia="Calibri" w:hAnsi="Calibri"/>
+                <w:b/>
+                <w:bCs/>
+                <w:color w:val="FFFFFF"/>
+                <w:sz w:val="21"/>
+                <w:szCs w:val="21"/>
+              </w:rPr>
+              <w:t xml:space="preserve">Description</w:t>
+            </w:r>
+          </w:p>
+        </w:tc>
+      </w:tr>
+      <w:tr>
+        <w:trPr>
+          <w:tblHeader w:val="false"/>
+        </w:trPr>
+        <w:tc>
+          <w:tcPr>
+            <w:tcW w:type="dxa" w:w="3300"/>
+            <w:tcMar>
+              <w:top w:type="dxa" w:w="60"/>
+              <w:left w:type="dxa" w:w="100"/>
+              <w:bottom w:type="dxa" w:w="60"/>
+              <w:right w:type="dxa" w:w="100"/>
+            </w:tcMar>
+            <w:vAlign w:val="center"/>
+          </w:tcPr>
+          <w:p>
+            <w:pPr>
+              <w:spacing w:after="0"/>
+            </w:pPr>
+            <w:r>
+              <w:rPr>
+                <w:rFonts w:ascii="Calibri" w:cs="Calibri" w:eastAsia="Calibri" w:hAnsi="Calibri"/>
+                <w:b w:val="false"/>
+                <w:bCs w:val="false"/>
+                <w:color w:val="1F2937"/>
+                <w:sz w:val="20"/>
+                <w:szCs w:val="20"/>
+              </w:rPr>
+              <w:t xml:space="preserve">disabled</w:t>
+            </w:r>
+          </w:p>
+        </w:tc>
+        <w:tc>
+          <w:tcPr>
+            <w:tcW w:type="dxa" w:w="1300"/>
+            <w:tcMar>
+              <w:top w:type="dxa" w:w="60"/>
+              <w:left w:type="dxa" w:w="100"/>
+              <w:bottom w:type="dxa" w:w="60"/>
+              <w:right w:type="dxa" w:w="100"/>
+            </w:tcMar>
+            <w:vAlign w:val="center"/>
+          </w:tcPr>
+          <w:p>
+            <w:pPr>
+              <w:spacing w:after="0"/>
+            </w:pPr>
+            <w:r>
+              <w:rPr>
+                <w:rFonts w:ascii="Calibri" w:cs="Calibri" w:eastAsia="Calibri" w:hAnsi="Calibri"/>
+                <w:b w:val="false"/>
+                <w:bCs w:val="false"/>
+                <w:color w:val="1F2937"/>
+                <w:sz w:val="20"/>
+                <w:szCs w:val="20"/>
+              </w:rPr>
+              <w:t xml:space="preserve">No</w:t>
+            </w:r>
+          </w:p>
+        </w:tc>
+        <w:tc>
+          <w:tcPr>
+            <w:tcW w:type="dxa" w:w="4760"/>
+            <w:tcMar>
+              <w:top w:type="dxa" w:w="60"/>
+              <w:left w:type="dxa" w:w="100"/>
+              <w:bottom w:type="dxa" w:w="60"/>
+              <w:right w:type="dxa" w:w="100"/>
+            </w:tcMar>
+            <w:vAlign w:val="center"/>
+          </w:tcPr>
+          <w:p>
+            <w:pPr>
+              <w:spacing w:after="0"/>
+            </w:pPr>
+            <w:r>
+              <w:rPr>
+                <w:rFonts w:ascii="Calibri" w:cs="Calibri" w:eastAsia="Calibri" w:hAnsi="Calibri"/>
+                <w:b w:val="false"/>
+                <w:bCs w:val="false"/>
+                <w:color w:val="1F2937"/>
+                <w:sz w:val="20"/>
+                <w:szCs w:val="20"/>
+              </w:rPr>
+              <w:t xml:space="preserve">Set true to skip the entry entirely.</w:t>
+            </w:r>
+          </w:p>
+        </w:tc>
+      </w:tr>
+      <w:tr>
+        <w:trPr>
+          <w:tblHeader w:val="false"/>
+        </w:trPr>
+        <w:tc>
+          <w:tcPr>
+            <w:tcW w:type="dxa" w:w="3300"/>
+            <w:tcMar>
+              <w:top w:type="dxa" w:w="60"/>
+              <w:left w:type="dxa" w:w="100"/>
+              <w:bottom w:type="dxa" w:w="60"/>
+              <w:right w:type="dxa" w:w="100"/>
+            </w:tcMar>
+            <w:vAlign w:val="center"/>
+          </w:tcPr>
+          <w:p>
+            <w:pPr>
+              <w:spacing w:after="0"/>
+            </w:pPr>
+            <w:r>
+              <w:rPr>
+                <w:rFonts w:ascii="Calibri" w:cs="Calibri" w:eastAsia="Calibri" w:hAnsi="Calibri"/>
+                <w:b w:val="false"/>
+                <w:bCs w:val="false"/>
+                <w:color w:val="1F2937"/>
+                <w:sz w:val="20"/>
+                <w:szCs w:val="20"/>
+              </w:rPr>
+              <w:t xml:space="preserve">script.name</w:t>
+            </w:r>
+          </w:p>
+        </w:tc>
+        <w:tc>
+          <w:tcPr>
+            <w:tcW w:type="dxa" w:w="1300"/>
+            <w:tcMar>
+              <w:top w:type="dxa" w:w="60"/>
+              <w:left w:type="dxa" w:w="100"/>
+              <w:bottom w:type="dxa" w:w="60"/>
+              <w:right w:type="dxa" w:w="100"/>
+            </w:tcMar>
+            <w:vAlign w:val="center"/>
+          </w:tcPr>
+          <w:p>
+            <w:pPr>
+              <w:spacing w:after="0"/>
+            </w:pPr>
+            <w:r>
+              <w:rPr>
+                <w:rFonts w:ascii="Calibri" w:cs="Calibri" w:eastAsia="Calibri" w:hAnsi="Calibri"/>
+                <w:b w:val="false"/>
+                <w:bCs w:val="false"/>
+                <w:color w:val="1F2937"/>
+                <w:sz w:val="20"/>
+                <w:szCs w:val="20"/>
+              </w:rPr>
+              <w:t xml:space="preserve">Yes*</w:t>
+            </w:r>
+          </w:p>
+        </w:tc>
+        <w:tc>
+          <w:tcPr>
+            <w:tcW w:type="dxa" w:w="4760"/>
+            <w:tcMar>
+              <w:top w:type="dxa" w:w="60"/>
+              <w:left w:type="dxa" w:w="100"/>
+              <w:bottom w:type="dxa" w:w="60"/>
+              <w:right w:type="dxa" w:w="100"/>
+            </w:tcMar>
+            <w:vAlign w:val="center"/>
+          </w:tcPr>
+          <w:p>
+            <w:pPr>
+              <w:spacing w:after="0"/>
+            </w:pPr>
+            <w:r>
+              <w:rPr>
+                <w:rFonts w:ascii="Calibri" w:cs="Calibri" w:eastAsia="Calibri" w:hAnsi="Calibri"/>
+                <w:b w:val="false"/>
+                <w:bCs w:val="false"/>
+                <w:color w:val="1F2937"/>
+                <w:sz w:val="20"/>
+                <w:szCs w:val="20"/>
+              </w:rPr>
+              <w:t xml:space="preserve">Exact script name in the Action Center Script Library. (*Either name or uuid.)</w:t>
+            </w:r>
+          </w:p>
+        </w:tc>
+      </w:tr>
+      <w:tr>
+        <w:trPr>
+          <w:tblHeader w:val="false"/>
+        </w:trPr>
+        <w:tc>
+          <w:tcPr>
+            <w:tcW w:type="dxa" w:w="3300"/>
+            <w:tcMar>
+              <w:top w:type="dxa" w:w="60"/>
+              <w:left w:type="dxa" w:w="100"/>
+              <w:bottom w:type="dxa" w:w="60"/>
+              <w:right w:type="dxa" w:w="100"/>
+            </w:tcMar>
+            <w:vAlign w:val="center"/>
+          </w:tcPr>
+          <w:p>
+            <w:pPr>
+              <w:spacing w:after="0"/>
+            </w:pPr>
+            <w:r>
+              <w:rPr>
+                <w:rFonts w:ascii="Calibri" w:cs="Calibri" w:eastAsia="Calibri" w:hAnsi="Calibri"/>
+                <w:b w:val="false"/>
+                <w:bCs w:val="false"/>
+                <w:color w:val="1F2937"/>
+                <w:sz w:val="20"/>
+                <w:szCs w:val="20"/>
+              </w:rPr>
+              <w:t xml:space="preserve">script.uuid</w:t>
+            </w:r>
+          </w:p>
+        </w:tc>
+        <w:tc>
+          <w:tcPr>
+            <w:tcW w:type="dxa" w:w="1300"/>
+            <w:tcMar>
+              <w:top w:type="dxa" w:w="60"/>
+              <w:left w:type="dxa" w:w="100"/>
+              <w:bottom w:type="dxa" w:w="60"/>
+              <w:right w:type="dxa" w:w="100"/>
+            </w:tcMar>
+            <w:vAlign w:val="center"/>
+          </w:tcPr>
+          <w:p>
+            <w:pPr>
+              <w:spacing w:after="0"/>
+            </w:pPr>
+            <w:r>
+              <w:rPr>
+                <w:rFonts w:ascii="Calibri" w:cs="Calibri" w:eastAsia="Calibri" w:hAnsi="Calibri"/>
+                <w:b w:val="false"/>
+                <w:bCs w:val="false"/>
+                <w:color w:val="1F2937"/>
+                <w:sz w:val="20"/>
+                <w:szCs w:val="20"/>
+              </w:rPr>
+              <w:t xml:space="preserve">No</w:t>
+            </w:r>
+          </w:p>
+        </w:tc>
+        <w:tc>
+          <w:tcPr>
+            <w:tcW w:type="dxa" w:w="4760"/>
+            <w:tcMar>
+              <w:top w:type="dxa" w:w="60"/>
+              <w:left w:type="dxa" w:w="100"/>
+              <w:bottom w:type="dxa" w:w="60"/>
+              <w:right w:type="dxa" w:w="100"/>
+            </w:tcMar>
+            <w:vAlign w:val="center"/>
+          </w:tcPr>
+          <w:p>
+            <w:pPr>
+              <w:spacing w:after="0"/>
+            </w:pPr>
+            <w:r>
+              <w:rPr>
+                <w:rFonts w:ascii="Calibri" w:cs="Calibri" w:eastAsia="Calibri" w:hAnsi="Calibri"/>
+                <w:b w:val="false"/>
+                <w:bCs w:val="false"/>
+                <w:color w:val="1F2937"/>
+                <w:sz w:val="20"/>
+                <w:szCs w:val="20"/>
+              </w:rPr>
+              <w:t xml:space="preserve">Script UUID — takes precedence over name and disambiguates duplicate names.</w:t>
+            </w:r>
+          </w:p>
+        </w:tc>
+      </w:tr>
+      <w:tr>
+        <w:trPr>
+          <w:tblHeader w:val="false"/>
+        </w:trPr>
+        <w:tc>
+          <w:tcPr>
+            <w:tcW w:type="dxa" w:w="3300"/>
+            <w:tcMar>
+              <w:top w:type="dxa" w:w="60"/>
+              <w:left w:type="dxa" w:w="100"/>
+              <w:bottom w:type="dxa" w:w="60"/>
+              <w:right w:type="dxa" w:w="100"/>
+            </w:tcMar>
+            <w:vAlign w:val="center"/>
+          </w:tcPr>
+          <w:p>
+            <w:pPr>
+              <w:spacing w:after="0"/>
+            </w:pPr>
+            <w:r>
+              <w:rPr>
+                <w:rFonts w:ascii="Calibri" w:cs="Calibri" w:eastAsia="Calibri" w:hAnsi="Calibri"/>
+                <w:b w:val="false"/>
+                <w:bCs w:val="false"/>
+                <w:color w:val="1F2937"/>
+                <w:sz w:val="20"/>
+                <w:szCs w:val="20"/>
+              </w:rPr>
+              <w:t xml:space="preserve">script.polling_interval_in_seconds</w:t>
+            </w:r>
+          </w:p>
+        </w:tc>
+        <w:tc>
+          <w:tcPr>
+            <w:tcW w:type="dxa" w:w="1300"/>
+            <w:tcMar>
+              <w:top w:type="dxa" w:w="60"/>
+              <w:left w:type="dxa" w:w="100"/>
+              <w:bottom w:type="dxa" w:w="60"/>
+              <w:right w:type="dxa" w:w="100"/>
+            </w:tcMar>
+            <w:vAlign w:val="center"/>
+          </w:tcPr>
+          <w:p>
+            <w:pPr>
+              <w:spacing w:after="0"/>
+            </w:pPr>
+            <w:r>
+              <w:rPr>
+                <w:rFonts w:ascii="Calibri" w:cs="Calibri" w:eastAsia="Calibri" w:hAnsi="Calibri"/>
+                <w:b w:val="false"/>
+                <w:bCs w:val="false"/>
+                <w:color w:val="1F2937"/>
+                <w:sz w:val="20"/>
+                <w:szCs w:val="20"/>
+              </w:rPr>
+              <w:t xml:space="preserve">No</w:t>
+            </w:r>
+          </w:p>
+        </w:tc>
+        <w:tc>
+          <w:tcPr>
+            <w:tcW w:type="dxa" w:w="4760"/>
+            <w:tcMar>
+              <w:top w:type="dxa" w:w="60"/>
+              <w:left w:type="dxa" w:w="100"/>
+              <w:bottom w:type="dxa" w:w="60"/>
+              <w:right w:type="dxa" w:w="100"/>
+            </w:tcMar>
+            <w:vAlign w:val="center"/>
+          </w:tcPr>
+          <w:p>
+            <w:pPr>
+              <w:spacing w:after="0"/>
+            </w:pPr>
+            <w:r>
+              <w:rPr>
+                <w:rFonts w:ascii="Calibri" w:cs="Calibri" w:eastAsia="Calibri" w:hAnsi="Calibri"/>
+                <w:b w:val="false"/>
+                <w:bCs w:val="false"/>
+                <w:color w:val="1F2937"/>
+                <w:sz w:val="20"/>
+                <w:szCs w:val="20"/>
+              </w:rPr>
+              <w:t xml:space="preserve">Poll cadence while the script runs (default 60).</w:t>
+            </w:r>
+          </w:p>
+        </w:tc>
+      </w:tr>
+      <w:tr>
+        <w:trPr>
+          <w:tblHeader w:val="false"/>
+        </w:trPr>
+        <w:tc>
+          <w:tcPr>
+            <w:tcW w:type="dxa" w:w="3300"/>
+            <w:tcMar>
+              <w:top w:type="dxa" w:w="60"/>
+              <w:left w:type="dxa" w:w="100"/>
+              <w:bottom w:type="dxa" w:w="60"/>
+              <w:right w:type="dxa" w:w="100"/>
+            </w:tcMar>
+            <w:vAlign w:val="center"/>
+          </w:tcPr>
+          <w:p>
+            <w:pPr>
+              <w:spacing w:after="0"/>
+            </w:pPr>
+            <w:r>
+              <w:rPr>
+                <w:rFonts w:ascii="Calibri" w:cs="Calibri" w:eastAsia="Calibri" w:hAnsi="Calibri"/>
+                <w:b w:val="false"/>
+                <w:bCs w:val="false"/>
+                <w:color w:val="1F2937"/>
+                <w:sz w:val="20"/>
+                <w:szCs w:val="20"/>
+              </w:rPr>
+              <w:t xml:space="preserve">script.timeout_in_seconds</w:t>
+            </w:r>
+          </w:p>
+        </w:tc>
+        <w:tc>
+          <w:tcPr>
+            <w:tcW w:type="dxa" w:w="1300"/>
+            <w:tcMar>
+              <w:top w:type="dxa" w:w="60"/>
+              <w:left w:type="dxa" w:w="100"/>
+              <w:bottom w:type="dxa" w:w="60"/>
+              <w:right w:type="dxa" w:w="100"/>
+            </w:tcMar>
+            <w:vAlign w:val="center"/>
+          </w:tcPr>
+          <w:p>
+            <w:pPr>
+              <w:spacing w:after="0"/>
+            </w:pPr>
+            <w:r>
+              <w:rPr>
+                <w:rFonts w:ascii="Calibri" w:cs="Calibri" w:eastAsia="Calibri" w:hAnsi="Calibri"/>
+                <w:b w:val="false"/>
+                <w:bCs w:val="false"/>
+                <w:color w:val="1F2937"/>
+                <w:sz w:val="20"/>
+                <w:szCs w:val="20"/>
+              </w:rPr>
+              <w:t xml:space="preserve">No</w:t>
+            </w:r>
+          </w:p>
+        </w:tc>
+        <w:tc>
+          <w:tcPr>
+            <w:tcW w:type="dxa" w:w="4760"/>
+            <w:tcMar>
+              <w:top w:type="dxa" w:w="60"/>
+              <w:left w:type="dxa" w:w="100"/>
+              <w:bottom w:type="dxa" w:w="60"/>
+              <w:right w:type="dxa" w:w="100"/>
+            </w:tcMar>
+            <w:vAlign w:val="center"/>
+          </w:tcPr>
+          <w:p>
+            <w:pPr>
+              <w:spacing w:after="0"/>
+            </w:pPr>
+            <w:r>
+              <w:rPr>
+                <w:rFonts w:ascii="Calibri" w:cs="Calibri" w:eastAsia="Calibri" w:hAnsi="Calibri"/>
+                <w:b w:val="false"/>
+                <w:bCs w:val="false"/>
+                <w:color w:val="1F2937"/>
+                <w:sz w:val="20"/>
+                <w:szCs w:val="20"/>
+              </w:rPr>
+              <w:t xml:space="preserve">Overall execution timeout (default 1800).</w:t>
+            </w:r>
+          </w:p>
+        </w:tc>
+      </w:tr>
+      <w:tr>
+        <w:trPr>
+          <w:tblHeader w:val="false"/>
+        </w:trPr>
+        <w:tc>
+          <w:tcPr>
+            <w:tcW w:type="dxa" w:w="3300"/>
+            <w:tcMar>
+              <w:top w:type="dxa" w:w="60"/>
+              <w:left w:type="dxa" w:w="100"/>
+              <w:bottom w:type="dxa" w:w="60"/>
+              <w:right w:type="dxa" w:w="100"/>
+            </w:tcMar>
+            <w:vAlign w:val="center"/>
+          </w:tcPr>
+          <w:p>
+            <w:pPr>
+              <w:spacing w:after="0"/>
+            </w:pPr>
+            <w:r>
+              <w:rPr>
+                <w:rFonts w:ascii="Calibri" w:cs="Calibri" w:eastAsia="Calibri" w:hAnsi="Calibri"/>
+                <w:b w:val="false"/>
+                <w:bCs w:val="false"/>
+                <w:color w:val="1F2937"/>
+                <w:sz w:val="20"/>
+                <w:szCs w:val="20"/>
+              </w:rPr>
+              <w:t xml:space="preserve">target.endpoint_os</w:t>
+            </w:r>
+          </w:p>
+        </w:tc>
+        <w:tc>
+          <w:tcPr>
+            <w:tcW w:type="dxa" w:w="1300"/>
+            <w:tcMar>
+              <w:top w:type="dxa" w:w="60"/>
+              <w:left w:type="dxa" w:w="100"/>
+              <w:bottom w:type="dxa" w:w="60"/>
+              <w:right w:type="dxa" w:w="100"/>
+            </w:tcMar>
+            <w:vAlign w:val="center"/>
+          </w:tcPr>
+          <w:p>
+            <w:pPr>
+              <w:spacing w:after="0"/>
+            </w:pPr>
+            <w:r>
+              <w:rPr>
+                <w:rFonts w:ascii="Calibri" w:cs="Calibri" w:eastAsia="Calibri" w:hAnsi="Calibri"/>
+                <w:b w:val="false"/>
+                <w:bCs w:val="false"/>
+                <w:color w:val="1F2937"/>
+                <w:sz w:val="20"/>
+                <w:szCs w:val="20"/>
+              </w:rPr>
+              <w:t xml:space="preserve">Yes</w:t>
+            </w:r>
+          </w:p>
+        </w:tc>
+        <w:tc>
+          <w:tcPr>
+            <w:tcW w:type="dxa" w:w="4760"/>
+            <w:tcMar>
+              <w:top w:type="dxa" w:w="60"/>
+              <w:left w:type="dxa" w:w="100"/>
+              <w:bottom w:type="dxa" w:w="60"/>
+              <w:right w:type="dxa" w:w="100"/>
+            </w:tcMar>
+            <w:vAlign w:val="center"/>
+          </w:tcPr>
+          <w:p>
+            <w:pPr>
+              <w:spacing w:after="0"/>
+            </w:pPr>
+            <w:r>
+              <w:rPr>
+                <w:rFonts w:ascii="Calibri" w:cs="Calibri" w:eastAsia="Calibri" w:hAnsi="Calibri"/>
+                <w:b w:val="false"/>
+                <w:bCs w:val="false"/>
+                <w:color w:val="1F2937"/>
+                <w:sz w:val="20"/>
+                <w:szCs w:val="20"/>
+              </w:rPr>
+              <w:t xml:space="preserve">Windows, macOS, or Linux (case-insensitive).</w:t>
+            </w:r>
+          </w:p>
+        </w:tc>
+      </w:tr>
+      <w:tr>
+        <w:trPr>
+          <w:tblHeader w:val="false"/>
+        </w:trPr>
+        <w:tc>
+          <w:tcPr>
+            <w:tcW w:type="dxa" w:w="3300"/>
+            <w:tcMar>
+              <w:top w:type="dxa" w:w="60"/>
+              <w:left w:type="dxa" w:w="100"/>
+              <w:bottom w:type="dxa" w:w="60"/>
+              <w:right w:type="dxa" w:w="100"/>
+            </w:tcMar>
+            <w:vAlign w:val="center"/>
+          </w:tcPr>
+          <w:p>
+            <w:pPr>
+              <w:spacing w:after="0"/>
+            </w:pPr>
+            <w:r>
+              <w:rPr>
+                <w:rFonts w:ascii="Calibri" w:cs="Calibri" w:eastAsia="Calibri" w:hAnsi="Calibri"/>
+                <w:b w:val="false"/>
+                <w:bCs w:val="false"/>
+                <w:color w:val="1F2937"/>
+                <w:sz w:val="20"/>
+                <w:szCs w:val="20"/>
+              </w:rPr>
+              <w:t xml:space="preserve">target.endpoint_groups</w:t>
+            </w:r>
+          </w:p>
+        </w:tc>
+        <w:tc>
+          <w:tcPr>
+            <w:tcW w:type="dxa" w:w="1300"/>
+            <w:tcMar>
+              <w:top w:type="dxa" w:w="60"/>
+              <w:left w:type="dxa" w:w="100"/>
+              <w:bottom w:type="dxa" w:w="60"/>
+              <w:right w:type="dxa" w:w="100"/>
+            </w:tcMar>
+            <w:vAlign w:val="center"/>
+          </w:tcPr>
+          <w:p>
+            <w:pPr>
+              <w:spacing w:after="0"/>
+            </w:pPr>
+            <w:r>
+              <w:rPr>
+                <w:rFonts w:ascii="Calibri" w:cs="Calibri" w:eastAsia="Calibri" w:hAnsi="Calibri"/>
+                <w:b w:val="false"/>
+                <w:bCs w:val="false"/>
+                <w:color w:val="1F2937"/>
+                <w:sz w:val="20"/>
+                <w:szCs w:val="20"/>
+              </w:rPr>
+              <w:t xml:space="preserve">One of these</w:t>
+            </w:r>
+          </w:p>
+        </w:tc>
+        <w:tc>
+          <w:tcPr>
+            <w:tcW w:type="dxa" w:w="4760"/>
+            <w:tcMar>
+              <w:top w:type="dxa" w:w="60"/>
+              <w:left w:type="dxa" w:w="100"/>
+              <w:bottom w:type="dxa" w:w="60"/>
+              <w:right w:type="dxa" w:w="100"/>
+            </w:tcMar>
+            <w:vAlign w:val="center"/>
+          </w:tcPr>
+          <w:p>
+            <w:pPr>
+              <w:spacing w:after="0"/>
+            </w:pPr>
+            <w:r>
+              <w:rPr>
+                <w:rFonts w:ascii="Calibri" w:cs="Calibri" w:eastAsia="Calibri" w:hAnsi="Calibri"/>
+                <w:b w:val="false"/>
+                <w:bCs w:val="false"/>
+                <w:color w:val="1F2937"/>
+                <w:sz w:val="20"/>
+                <w:szCs w:val="20"/>
+              </w:rPr>
+              <w:t xml:space="preserve">Endpoint group names to scope execution.</w:t>
+            </w:r>
+          </w:p>
+        </w:tc>
+      </w:tr>
+      <w:tr>
+        <w:trPr>
+          <w:tblHeader w:val="false"/>
+        </w:trPr>
+        <w:tc>
+          <w:tcPr>
+            <w:tcW w:type="dxa" w:w="3300"/>
+            <w:tcMar>
+              <w:top w:type="dxa" w:w="60"/>
+              <w:left w:type="dxa" w:w="100"/>
+              <w:bottom w:type="dxa" w:w="60"/>
+              <w:right w:type="dxa" w:w="100"/>
+            </w:tcMar>
+            <w:vAlign w:val="center"/>
+          </w:tcPr>
+          <w:p>
+            <w:pPr>
+              <w:spacing w:after="0"/>
+            </w:pPr>
+            <w:r>
+              <w:rPr>
+                <w:rFonts w:ascii="Calibri" w:cs="Calibri" w:eastAsia="Calibri" w:hAnsi="Calibri"/>
+                <w:b w:val="false"/>
+                <w:bCs w:val="false"/>
+                <w:color w:val="1F2937"/>
+                <w:sz w:val="20"/>
+                <w:szCs w:val="20"/>
+              </w:rPr>
+              <w:t xml:space="preserve">target.endpoint_hostnames</w:t>
+            </w:r>
+          </w:p>
+        </w:tc>
+        <w:tc>
+          <w:tcPr>
+            <w:tcW w:type="dxa" w:w="1300"/>
+            <w:tcMar>
+              <w:top w:type="dxa" w:w="60"/>
+              <w:left w:type="dxa" w:w="100"/>
+              <w:bottom w:type="dxa" w:w="60"/>
+              <w:right w:type="dxa" w:w="100"/>
+            </w:tcMar>
+            <w:vAlign w:val="center"/>
+          </w:tcPr>
+          <w:p>
+            <w:pPr>
+              <w:spacing w:after="0"/>
+            </w:pPr>
+            <w:r>
+              <w:rPr>
+                <w:rFonts w:ascii="Calibri" w:cs="Calibri" w:eastAsia="Calibri" w:hAnsi="Calibri"/>
+                <w:b w:val="false"/>
+                <w:bCs w:val="false"/>
+                <w:color w:val="1F2937"/>
+                <w:sz w:val="20"/>
+                <w:szCs w:val="20"/>
+              </w:rPr>
+              <w:t xml:space="preserve">One of these</w:t>
+            </w:r>
+          </w:p>
+        </w:tc>
+        <w:tc>
+          <w:tcPr>
+            <w:tcW w:type="dxa" w:w="4760"/>
+            <w:tcMar>
+              <w:top w:type="dxa" w:w="60"/>
+              <w:left w:type="dxa" w:w="100"/>
+              <w:bottom w:type="dxa" w:w="60"/>
+              <w:right w:type="dxa" w:w="100"/>
+            </w:tcMar>
+            <w:vAlign w:val="center"/>
+          </w:tcPr>
+          <w:p>
+            <w:pPr>
+              <w:spacing w:after="0"/>
+            </w:pPr>
+            <w:r>
+              <w:rPr>
+                <w:rFonts w:ascii="Calibri" w:cs="Calibri" w:eastAsia="Calibri" w:hAnsi="Calibri"/>
+                <w:b w:val="false"/>
+                <w:bCs w:val="false"/>
+                <w:color w:val="1F2937"/>
+                <w:sz w:val="20"/>
+                <w:szCs w:val="20"/>
+              </w:rPr>
+              <w:t xml:space="preserve">Specific hostnames to scope execution.</w:t>
+            </w:r>
+          </w:p>
+        </w:tc>
+      </w:tr>
+      <w:tr>
+        <w:trPr>
+          <w:tblHeader w:val="false"/>
+        </w:trPr>
+        <w:tc>
+          <w:tcPr>
+            <w:tcW w:type="dxa" w:w="3300"/>
+            <w:tcMar>
+              <w:top w:type="dxa" w:w="60"/>
+              <w:left w:type="dxa" w:w="100"/>
+              <w:bottom w:type="dxa" w:w="60"/>
+              <w:right w:type="dxa" w:w="100"/>
+            </w:tcMar>
+            <w:vAlign w:val="center"/>
+          </w:tcPr>
+          <w:p>
+            <w:pPr>
+              <w:spacing w:after="0"/>
+            </w:pPr>
+            <w:r>
+              <w:rPr>
+                <w:rFonts w:ascii="Calibri" w:cs="Calibri" w:eastAsia="Calibri" w:hAnsi="Calibri"/>
+                <w:b w:val="false"/>
+                <w:bCs w:val="false"/>
+                <w:color w:val="1F2937"/>
+                <w:sz w:val="20"/>
+                <w:szCs w:val="20"/>
+              </w:rPr>
+              <w:t xml:space="preserve">notification.recipients</w:t>
+            </w:r>
+          </w:p>
+        </w:tc>
+        <w:tc>
+          <w:tcPr>
+            <w:tcW w:type="dxa" w:w="1300"/>
+            <w:tcMar>
+              <w:top w:type="dxa" w:w="60"/>
+              <w:left w:type="dxa" w:w="100"/>
+              <w:bottom w:type="dxa" w:w="60"/>
+              <w:right w:type="dxa" w:w="100"/>
+            </w:tcMar>
+            <w:vAlign w:val="center"/>
+          </w:tcPr>
+          <w:p>
+            <w:pPr>
+              <w:spacing w:after="0"/>
+            </w:pPr>
+            <w:r>
+              <w:rPr>
+                <w:rFonts w:ascii="Calibri" w:cs="Calibri" w:eastAsia="Calibri" w:hAnsi="Calibri"/>
+                <w:b w:val="false"/>
+                <w:bCs w:val="false"/>
+                <w:color w:val="1F2937"/>
+                <w:sz w:val="20"/>
+                <w:szCs w:val="20"/>
+              </w:rPr>
+              <w:t xml:space="preserve">No</w:t>
+            </w:r>
+          </w:p>
+        </w:tc>
+        <w:tc>
+          <w:tcPr>
+            <w:tcW w:type="dxa" w:w="4760"/>
+            <w:tcMar>
+              <w:top w:type="dxa" w:w="60"/>
+              <w:left w:type="dxa" w:w="100"/>
+              <w:bottom w:type="dxa" w:w="60"/>
+              <w:right w:type="dxa" w:w="100"/>
+            </w:tcMar>
+            <w:vAlign w:val="center"/>
+          </w:tcPr>
+          <w:p>
+            <w:pPr>
+              <w:spacing w:after="0"/>
+            </w:pPr>
+            <w:r>
+              <w:rPr>
+                <w:rFonts w:ascii="Calibri" w:cs="Calibri" w:eastAsia="Calibri" w:hAnsi="Calibri"/>
+                <w:b w:val="false"/>
+                <w:bCs w:val="false"/>
+                <w:color w:val="1F2937"/>
+                <w:sz w:val="20"/>
+                <w:szCs w:val="20"/>
+              </w:rPr>
+              <w:t xml:space="preserve">Email recipients for the per-entry outcome; omit for no email.</w:t>
+            </w:r>
+          </w:p>
+        </w:tc>
+      </w:tr>
+      <w:tr>
+        <w:trPr>
+          <w:tblHeader w:val="false"/>
+        </w:trPr>
+        <w:tc>
+          <w:tcPr>
+            <w:tcW w:type="dxa" w:w="3300"/>
+            <w:tcMar>
+              <w:top w:type="dxa" w:w="60"/>
+              <w:left w:type="dxa" w:w="100"/>
+              <w:bottom w:type="dxa" w:w="60"/>
+              <w:right w:type="dxa" w:w="100"/>
+            </w:tcMar>
+            <w:vAlign w:val="center"/>
+          </w:tcPr>
+          <w:p>
+            <w:pPr>
+              <w:spacing w:after="0"/>
+            </w:pPr>
+            <w:r>
+              <w:rPr>
+                <w:rFonts w:ascii="Calibri" w:cs="Calibri" w:eastAsia="Calibri" w:hAnsi="Calibri"/>
+                <w:b w:val="false"/>
+                <w:bCs w:val="false"/>
+                <w:color w:val="1F2937"/>
+                <w:sz w:val="20"/>
+                <w:szCs w:val="20"/>
+              </w:rPr>
+              <w:t xml:space="preserve">notification.sendmail_instance.name</w:t>
+            </w:r>
+          </w:p>
+        </w:tc>
+        <w:tc>
+          <w:tcPr>
+            <w:tcW w:type="dxa" w:w="1300"/>
+            <w:tcMar>
+              <w:top w:type="dxa" w:w="60"/>
+              <w:left w:type="dxa" w:w="100"/>
+              <w:bottom w:type="dxa" w:w="60"/>
+              <w:right w:type="dxa" w:w="100"/>
+            </w:tcMar>
+            <w:vAlign w:val="center"/>
+          </w:tcPr>
+          <w:p>
+            <w:pPr>
+              <w:spacing w:after="0"/>
+            </w:pPr>
+            <w:r>
+              <w:rPr>
+                <w:rFonts w:ascii="Calibri" w:cs="Calibri" w:eastAsia="Calibri" w:hAnsi="Calibri"/>
+                <w:b w:val="false"/>
+                <w:bCs w:val="false"/>
+                <w:color w:val="1F2937"/>
+                <w:sz w:val="20"/>
+                <w:szCs w:val="20"/>
+              </w:rPr>
+              <w:t xml:space="preserve">No</w:t>
+            </w:r>
+          </w:p>
+        </w:tc>
+        <w:tc>
+          <w:tcPr>
+            <w:tcW w:type="dxa" w:w="4760"/>
+            <w:tcMar>
+              <w:top w:type="dxa" w:w="60"/>
+              <w:left w:type="dxa" w:w="100"/>
+              <w:bottom w:type="dxa" w:w="60"/>
+              <w:right w:type="dxa" w:w="100"/>
+            </w:tcMar>
+            <w:vAlign w:val="center"/>
+          </w:tcPr>
+          <w:p>
+            <w:pPr>
+              <w:spacing w:after="0"/>
+            </w:pPr>
+            <w:r>
+              <w:rPr>
+                <w:rFonts w:ascii="Calibri" w:cs="Calibri" w:eastAsia="Calibri" w:hAnsi="Calibri"/>
+                <w:b w:val="false"/>
+                <w:bCs w:val="false"/>
+                <w:color w:val="1F2937"/>
+                <w:sz w:val="20"/>
+                <w:szCs w:val="20"/>
+              </w:rPr>
+              <w:t xml:space="preserve">Specific mail-sender instance; omit to use any enabled one.</w:t>
+            </w:r>
+          </w:p>
+        </w:tc>
+      </w:tr>
+    </w:tbl>
+    <w:p>
+      <w:pPr>
+        <w:pStyle w:val="Heading2"/>
+        <w:spacing w:after="120" w:before="280"/>
+      </w:pPr>
+      <w:r>
+        <w:rPr>
+          <w:rFonts w:ascii="Calibri" w:cs="Calibri" w:eastAsia="Calibri" w:hAnsi="Calibri"/>
+          <w:b/>
+          <w:bCs/>
+          <w:color w:val="1F2937"/>
+          <w:sz w:val="26"/>
+          <w:szCs w:val="26"/>
+        </w:rPr>
+        <w:t xml:space="preserve">10.3 How scripts are matched to endpoints</w:t>
+      </w:r>
+    </w:p>
+    <w:p>
+      <w:pPr>
+        <w:spacing w:after="120"/>
+      </w:pPr>
+      <w:r>
+        <w:rPr>
+          <w:rFonts w:ascii="Calibri" w:cs="Calibri" w:eastAsia="Calibri" w:hAnsi="Calibri"/>
+          <w:color w:val="1F2937"/>
+          <w:sz w:val="22"/>
+          <w:szCs w:val="22"/>
+        </w:rPr>
+        <w:t xml:space="preserve">The pairing of script to operating system is declared per entry, and enforced at dispatch time: each entry queries endpoints with the entry's groups/hostnames AND its endpoint_os as a platform filter, restricted to connected, unisolated agents. A Windows entry therefore can never execute on a Mac even when both target the same mixed endpoint group — and one shared group can serve every OS, with each entry picking out its own members.</w:t>
+      </w:r>
+    </w:p>
+    <w:p>
+      <w:pPr>
+        <w:pStyle w:val="Heading2"/>
+        <w:spacing w:after="120" w:before="280"/>
+      </w:pPr>
+      <w:r>
+        <w:rPr>
+          <w:rFonts w:ascii="Calibri" w:cs="Calibri" w:eastAsia="Calibri" w:hAnsi="Calibri"/>
+          <w:b/>
+          <w:bCs/>
+          <w:color w:val="1F2937"/>
+          <w:sz w:val="26"/>
+          <w:szCs w:val="26"/>
+        </w:rPr>
+        <w:t xml:space="preserve">10.4 Job setup</w:t>
       </w:r>
     </w:p>
     <w:p>
@@ -5235,31 +6878,11 @@
       <w:r>
         <w:rPr>
           <w:rFonts w:ascii="Calibri" w:cs="Calibri" w:eastAsia="Calibri" w:hAnsi="Calibri"/>
-          <w:b/>
-          <w:bCs/>
           <w:color w:val="1F2937"/>
           <w:sz w:val="22"/>
           <w:szCs w:val="22"/>
         </w:rPr>
-        <w:t xml:space="preserve">Install the SDK: </w:t>
-      </w:r>
-      <w:r>
-        <w:rPr>
-          <w:rFonts w:ascii="Consolas" w:cs="Consolas" w:eastAsia="Consolas" w:hAnsi="Consolas"/>
-          <w:color w:val="1F2937"/>
-          <w:sz w:val="20"/>
-          <w:szCs w:val="20"/>
-        </w:rPr>
-        <w:t xml:space="preserve">pip3 install demisto-sdk</w:t>
-      </w:r>
-      <w:r>
-        <w:rPr>
-          <w:rFonts w:ascii="Calibri" w:cs="Calibri" w:eastAsia="Calibri" w:hAnsi="Calibri"/>
-          <w:color w:val="1F2937"/>
-          <w:sz w:val="22"/>
-          <w:szCs w:val="22"/>
-        </w:rPr>
-        <w:t xml:space="preserve"> (1.38+ required — older versions reject packs that declare the platform marketplace).</w:t>
+        <w:t xml:space="preserve">Investigation &amp; Response → Automation → Jobs → New Job.</w:t>
       </w:r>
     </w:p>
     <w:p>
@@ -5274,13 +6897,22 @@
       <w:r>
         <w:rPr>
           <w:rFonts w:ascii="Calibri" w:cs="Calibri" w:eastAsia="Calibri" w:hAnsi="Calibri"/>
+          <w:color w:val="1F2937"/>
+          <w:sz w:val="22"/>
+          <w:szCs w:val="22"/>
+        </w:rPr>
+        <w:t xml:space="preserve">Trigger: </w:t>
+      </w:r>
+      <w:r>
+        <w:rPr>
+          <w:rFonts w:ascii="Calibri" w:cs="Calibri" w:eastAsia="Calibri" w:hAnsi="Calibri"/>
           <w:b/>
           <w:bCs/>
           <w:color w:val="1F2937"/>
           <w:sz w:val="22"/>
           <w:szCs w:val="22"/>
         </w:rPr>
-        <w:t xml:space="preserve">Place the pack in a content-repo structure. </w:t>
+        <w:t xml:space="preserve">Time triggered</w:t>
       </w:r>
       <w:r>
         <w:rPr>
@@ -5289,7 +6921,7 @@
           <w:sz w:val="22"/>
           <w:szCs w:val="22"/>
         </w:rPr>
-        <w:t xml:space="preserve">demisto-sdk only runs inside a repo shaped like demisto/content: a git repository containing Packs/Koi/&lt;pack contents&gt;, an empty .private-repo-settings file at the root, and Tests/secrets_white_list.json containing {"iocs":[],"files":[],"generic_strings":[]}.</w:t>
+        <w:t xml:space="preserve">, choose the recurrence (e.g., hourly).</w:t>
       </w:r>
     </w:p>
     <w:p>
@@ -5304,13 +6936,494 @@
       <w:r>
         <w:rPr>
           <w:rFonts w:ascii="Calibri" w:cs="Calibri" w:eastAsia="Calibri" w:hAnsi="Calibri"/>
+          <w:color w:val="1F2937"/>
+          <w:sz w:val="22"/>
+          <w:szCs w:val="22"/>
+        </w:rPr>
+        <w:t xml:space="preserve">Playbook: </w:t>
+      </w:r>
+      <w:r>
+        <w:rPr>
+          <w:rFonts w:ascii="Calibri" w:cs="Calibri" w:eastAsia="Calibri" w:hAnsi="Calibri"/>
           <w:b/>
           <w:bCs/>
           <w:color w:val="1F2937"/>
           <w:sz w:val="22"/>
           <w:szCs w:val="22"/>
         </w:rPr>
-        <w:t xml:space="preserve">Set the connection environment variables: </w:t>
+        <w:t xml:space="preserve">Koi Unified - Script Runner</w:t>
+      </w:r>
+      <w:r>
+        <w:rPr>
+          <w:rFonts w:ascii="Calibri" w:cs="Calibri" w:eastAsia="Calibri" w:hAnsi="Calibri"/>
+          <w:color w:val="1F2937"/>
+          <w:sz w:val="22"/>
+          <w:szCs w:val="22"/>
+        </w:rPr>
+        <w:t xml:space="preserve">. Save, then use Run now for an immediate first run.</w:t>
+      </w:r>
+    </w:p>
+    <w:p>
+      <w:pPr>
+        <w:pStyle w:val="Heading2"/>
+        <w:spacing w:after="120" w:before="280"/>
+      </w:pPr>
+      <w:r>
+        <w:rPr>
+          <w:rFonts w:ascii="Calibri" w:cs="Calibri" w:eastAsia="Calibri" w:hAnsi="Calibri"/>
+          <w:b/>
+          <w:bCs/>
+          <w:color w:val="1F2937"/>
+          <w:sz w:val="26"/>
+          <w:szCs w:val="26"/>
+        </w:rPr>
+        <w:t xml:space="preserve">10.5 Run outcomes</w:t>
+      </w:r>
+    </w:p>
+    <w:tbl>
+      <w:tblPr>
+        <w:tblW w:type="dxa" w:w="9360"/>
+        <w:tblBorders>
+          <w:top w:val="single" w:color="auto" w:sz="4"/>
+          <w:left w:val="single" w:color="auto" w:sz="4"/>
+          <w:bottom w:val="single" w:color="auto" w:sz="4"/>
+          <w:right w:val="single" w:color="auto" w:sz="4"/>
+          <w:insideH w:val="single" w:color="auto" w:sz="4"/>
+          <w:insideV w:val="single" w:color="auto" w:sz="4"/>
+        </w:tblBorders>
+      </w:tblPr>
+      <w:tblGrid>
+        <w:gridCol w:w="2200"/>
+        <w:gridCol w:w="3800"/>
+        <w:gridCol w:w="3360"/>
+      </w:tblGrid>
+      <w:tr>
+        <w:trPr>
+          <w:tblHeader/>
+        </w:trPr>
+        <w:tc>
+          <w:tcPr>
+            <w:tcW w:type="dxa" w:w="2200"/>
+            <w:shd w:fill="334155" w:val="clear"/>
+            <w:tcMar>
+              <w:top w:type="dxa" w:w="60"/>
+              <w:left w:type="dxa" w:w="100"/>
+              <w:bottom w:type="dxa" w:w="60"/>
+              <w:right w:type="dxa" w:w="100"/>
+            </w:tcMar>
+            <w:vAlign w:val="center"/>
+          </w:tcPr>
+          <w:p>
+            <w:pPr>
+              <w:spacing w:after="0"/>
+            </w:pPr>
+            <w:r>
+              <w:rPr>
+                <w:rFonts w:ascii="Calibri" w:cs="Calibri" w:eastAsia="Calibri" w:hAnsi="Calibri"/>
+                <w:b/>
+                <w:bCs/>
+                <w:color w:val="FFFFFF"/>
+                <w:sz w:val="21"/>
+                <w:szCs w:val="21"/>
+              </w:rPr>
+              <w:t xml:space="preserve">Outcome</w:t>
+            </w:r>
+          </w:p>
+        </w:tc>
+        <w:tc>
+          <w:tcPr>
+            <w:tcW w:type="dxa" w:w="3800"/>
+            <w:shd w:fill="334155" w:val="clear"/>
+            <w:tcMar>
+              <w:top w:type="dxa" w:w="60"/>
+              <w:left w:type="dxa" w:w="100"/>
+              <w:bottom w:type="dxa" w:w="60"/>
+              <w:right w:type="dxa" w:w="100"/>
+            </w:tcMar>
+            <w:vAlign w:val="center"/>
+          </w:tcPr>
+          <w:p>
+            <w:pPr>
+              <w:spacing w:after="0"/>
+            </w:pPr>
+            <w:r>
+              <w:rPr>
+                <w:rFonts w:ascii="Calibri" w:cs="Calibri" w:eastAsia="Calibri" w:hAnsi="Calibri"/>
+                <w:b/>
+                <w:bCs/>
+                <w:color w:val="FFFFFF"/>
+                <w:sz w:val="21"/>
+                <w:szCs w:val="21"/>
+              </w:rPr>
+              <w:t xml:space="preserve">Meaning</w:t>
+            </w:r>
+          </w:p>
+        </w:tc>
+        <w:tc>
+          <w:tcPr>
+            <w:tcW w:type="dxa" w:w="3360"/>
+            <w:shd w:fill="334155" w:val="clear"/>
+            <w:tcMar>
+              <w:top w:type="dxa" w:w="60"/>
+              <w:left w:type="dxa" w:w="100"/>
+              <w:bottom w:type="dxa" w:w="60"/>
+              <w:right w:type="dxa" w:w="100"/>
+            </w:tcMar>
+            <w:vAlign w:val="center"/>
+          </w:tcPr>
+          <w:p>
+            <w:pPr>
+              <w:spacing w:after="0"/>
+            </w:pPr>
+            <w:r>
+              <w:rPr>
+                <w:rFonts w:ascii="Calibri" w:cs="Calibri" w:eastAsia="Calibri" w:hAnsi="Calibri"/>
+                <w:b/>
+                <w:bCs/>
+                <w:color w:val="FFFFFF"/>
+                <w:sz w:val="21"/>
+                <w:szCs w:val="21"/>
+              </w:rPr>
+              <w:t xml:space="preserve">Notification</w:t>
+            </w:r>
+          </w:p>
+        </w:tc>
+      </w:tr>
+      <w:tr>
+        <w:trPr>
+          <w:tblHeader w:val="false"/>
+        </w:trPr>
+        <w:tc>
+          <w:tcPr>
+            <w:tcW w:type="dxa" w:w="2200"/>
+            <w:tcMar>
+              <w:top w:type="dxa" w:w="60"/>
+              <w:left w:type="dxa" w:w="100"/>
+              <w:bottom w:type="dxa" w:w="60"/>
+              <w:right w:type="dxa" w:w="100"/>
+            </w:tcMar>
+            <w:vAlign w:val="center"/>
+          </w:tcPr>
+          <w:p>
+            <w:pPr>
+              <w:spacing w:after="0"/>
+            </w:pPr>
+            <w:r>
+              <w:rPr>
+                <w:rFonts w:ascii="Calibri" w:cs="Calibri" w:eastAsia="Calibri" w:hAnsi="Calibri"/>
+                <w:b w:val="false"/>
+                <w:bCs w:val="false"/>
+                <w:color w:val="1F2937"/>
+                <w:sz w:val="20"/>
+                <w:szCs w:val="20"/>
+              </w:rPr>
+              <w:t xml:space="preserve">ok: true (+ action_id)</w:t>
+            </w:r>
+          </w:p>
+        </w:tc>
+        <w:tc>
+          <w:tcPr>
+            <w:tcW w:type="dxa" w:w="3800"/>
+            <w:tcMar>
+              <w:top w:type="dxa" w:w="60"/>
+              <w:left w:type="dxa" w:w="100"/>
+              <w:bottom w:type="dxa" w:w="60"/>
+              <w:right w:type="dxa" w:w="100"/>
+            </w:tcMar>
+            <w:vAlign w:val="center"/>
+          </w:tcPr>
+          <w:p>
+            <w:pPr>
+              <w:spacing w:after="0"/>
+            </w:pPr>
+            <w:r>
+              <w:rPr>
+                <w:rFonts w:ascii="Calibri" w:cs="Calibri" w:eastAsia="Calibri" w:hAnsi="Calibri"/>
+                <w:b w:val="false"/>
+                <w:bCs w:val="false"/>
+                <w:color w:val="1F2937"/>
+                <w:sz w:val="20"/>
+                <w:szCs w:val="20"/>
+              </w:rPr>
+              <w:t xml:space="preserve">Script dispatched and completed; action_id links to Action Center.</w:t>
+            </w:r>
+          </w:p>
+        </w:tc>
+        <w:tc>
+          <w:tcPr>
+            <w:tcW w:type="dxa" w:w="3360"/>
+            <w:tcMar>
+              <w:top w:type="dxa" w:w="60"/>
+              <w:left w:type="dxa" w:w="100"/>
+              <w:bottom w:type="dxa" w:w="60"/>
+              <w:right w:type="dxa" w:w="100"/>
+            </w:tcMar>
+            <w:vAlign w:val="center"/>
+          </w:tcPr>
+          <w:p>
+            <w:pPr>
+              <w:spacing w:after="0"/>
+            </w:pPr>
+            <w:r>
+              <w:rPr>
+                <w:rFonts w:ascii="Calibri" w:cs="Calibri" w:eastAsia="Calibri" w:hAnsi="Calibri"/>
+                <w:b w:val="false"/>
+                <w:bCs w:val="false"/>
+                <w:color w:val="1F2937"/>
+                <w:sz w:val="20"/>
+                <w:szCs w:val="20"/>
+              </w:rPr>
+              <w:t xml:space="preserve">Success email (when recipients configured).</w:t>
+            </w:r>
+          </w:p>
+        </w:tc>
+      </w:tr>
+      <w:tr>
+        <w:trPr>
+          <w:tblHeader w:val="false"/>
+        </w:trPr>
+        <w:tc>
+          <w:tcPr>
+            <w:tcW w:type="dxa" w:w="2200"/>
+            <w:tcMar>
+              <w:top w:type="dxa" w:w="60"/>
+              <w:left w:type="dxa" w:w="100"/>
+              <w:bottom w:type="dxa" w:w="60"/>
+              <w:right w:type="dxa" w:w="100"/>
+            </w:tcMar>
+            <w:vAlign w:val="center"/>
+          </w:tcPr>
+          <w:p>
+            <w:pPr>
+              <w:spacing w:after="0"/>
+            </w:pPr>
+            <w:r>
+              <w:rPr>
+                <w:rFonts w:ascii="Calibri" w:cs="Calibri" w:eastAsia="Calibri" w:hAnsi="Calibri"/>
+                <w:b w:val="false"/>
+                <w:bCs w:val="false"/>
+                <w:color w:val="1F2937"/>
+                <w:sz w:val="20"/>
+                <w:szCs w:val="20"/>
+              </w:rPr>
+              <w:t xml:space="preserve">skipped: true</w:t>
+            </w:r>
+          </w:p>
+        </w:tc>
+        <w:tc>
+          <w:tcPr>
+            <w:tcW w:type="dxa" w:w="3800"/>
+            <w:tcMar>
+              <w:top w:type="dxa" w:w="60"/>
+              <w:left w:type="dxa" w:w="100"/>
+              <w:bottom w:type="dxa" w:w="60"/>
+              <w:right w:type="dxa" w:w="100"/>
+            </w:tcMar>
+            <w:vAlign w:val="center"/>
+          </w:tcPr>
+          <w:p>
+            <w:pPr>
+              <w:spacing w:after="0"/>
+            </w:pPr>
+            <w:r>
+              <w:rPr>
+                <w:rFonts w:ascii="Calibri" w:cs="Calibri" w:eastAsia="Calibri" w:hAnsi="Calibri"/>
+                <w:b w:val="false"/>
+                <w:bCs w:val="false"/>
+                <w:color w:val="1F2937"/>
+                <w:sz w:val="20"/>
+                <w:szCs w:val="20"/>
+              </w:rPr>
+              <w:t xml:space="preserve">Entry valid, but no connected endpoints currently match the target scope — nothing to do this run. Logged as an info entry.</w:t>
+            </w:r>
+          </w:p>
+        </w:tc>
+        <w:tc>
+          <w:tcPr>
+            <w:tcW w:type="dxa" w:w="3360"/>
+            <w:tcMar>
+              <w:top w:type="dxa" w:w="60"/>
+              <w:left w:type="dxa" w:w="100"/>
+              <w:bottom w:type="dxa" w:w="60"/>
+              <w:right w:type="dxa" w:w="100"/>
+            </w:tcMar>
+            <w:vAlign w:val="center"/>
+          </w:tcPr>
+          <w:p>
+            <w:pPr>
+              <w:spacing w:after="0"/>
+            </w:pPr>
+            <w:r>
+              <w:rPr>
+                <w:rFonts w:ascii="Calibri" w:cs="Calibri" w:eastAsia="Calibri" w:hAnsi="Calibri"/>
+                <w:b w:val="false"/>
+                <w:bCs w:val="false"/>
+                <w:color w:val="1F2937"/>
+                <w:sz w:val="20"/>
+                <w:szCs w:val="20"/>
+              </w:rPr>
+              <w:t xml:space="preserve">None — keeps recurring jobs quiet for not-yet-populated OS scopes.</w:t>
+            </w:r>
+          </w:p>
+        </w:tc>
+      </w:tr>
+      <w:tr>
+        <w:trPr>
+          <w:tblHeader w:val="false"/>
+        </w:trPr>
+        <w:tc>
+          <w:tcPr>
+            <w:tcW w:type="dxa" w:w="2200"/>
+            <w:tcMar>
+              <w:top w:type="dxa" w:w="60"/>
+              <w:left w:type="dxa" w:w="100"/>
+              <w:bottom w:type="dxa" w:w="60"/>
+              <w:right w:type="dxa" w:w="100"/>
+            </w:tcMar>
+            <w:vAlign w:val="center"/>
+          </w:tcPr>
+          <w:p>
+            <w:pPr>
+              <w:spacing w:after="0"/>
+            </w:pPr>
+            <w:r>
+              <w:rPr>
+                <w:rFonts w:ascii="Calibri" w:cs="Calibri" w:eastAsia="Calibri" w:hAnsi="Calibri"/>
+                <w:b w:val="false"/>
+                <w:bCs w:val="false"/>
+                <w:color w:val="1F2937"/>
+                <w:sz w:val="20"/>
+                <w:szCs w:val="20"/>
+              </w:rPr>
+              <w:t xml:space="preserve">ok: false + reason</w:t>
+            </w:r>
+          </w:p>
+        </w:tc>
+        <w:tc>
+          <w:tcPr>
+            <w:tcW w:type="dxa" w:w="3800"/>
+            <w:tcMar>
+              <w:top w:type="dxa" w:w="60"/>
+              <w:left w:type="dxa" w:w="100"/>
+              <w:bottom w:type="dxa" w:w="60"/>
+              <w:right w:type="dxa" w:w="100"/>
+            </w:tcMar>
+            <w:vAlign w:val="center"/>
+          </w:tcPr>
+          <w:p>
+            <w:pPr>
+              <w:spacing w:after="0"/>
+            </w:pPr>
+            <w:r>
+              <w:rPr>
+                <w:rFonts w:ascii="Calibri" w:cs="Calibri" w:eastAsia="Calibri" w:hAnsi="Calibri"/>
+                <w:b w:val="false"/>
+                <w:bCs w:val="false"/>
+                <w:color w:val="1F2937"/>
+                <w:sz w:val="20"/>
+                <w:szCs w:val="20"/>
+              </w:rPr>
+              <w:t xml:space="preserve">Real failure: script not found, ambiguous name, endpoint query error, or execution failure. The reason states which.</w:t>
+            </w:r>
+          </w:p>
+        </w:tc>
+        <w:tc>
+          <w:tcPr>
+            <w:tcW w:type="dxa" w:w="3360"/>
+            <w:tcMar>
+              <w:top w:type="dxa" w:w="60"/>
+              <w:left w:type="dxa" w:w="100"/>
+              <w:bottom w:type="dxa" w:w="60"/>
+              <w:right w:type="dxa" w:w="100"/>
+            </w:tcMar>
+            <w:vAlign w:val="center"/>
+          </w:tcPr>
+          <w:p>
+            <w:pPr>
+              <w:spacing w:after="0"/>
+            </w:pPr>
+            <w:r>
+              <w:rPr>
+                <w:rFonts w:ascii="Calibri" w:cs="Calibri" w:eastAsia="Calibri" w:hAnsi="Calibri"/>
+                <w:b w:val="false"/>
+                <w:bCs w:val="false"/>
+                <w:color w:val="1F2937"/>
+                <w:sz w:val="20"/>
+                <w:szCs w:val="20"/>
+              </w:rPr>
+              <w:t xml:space="preserve">Failure email (when recipients configured).</w:t>
+            </w:r>
+          </w:p>
+        </w:tc>
+      </w:tr>
+    </w:tbl>
+    <w:p>
+      <w:pPr>
+        <w:pStyle w:val="Heading1"/>
+        <w:spacing w:after="160" w:before="360"/>
+      </w:pPr>
+      <w:r>
+        <w:rPr>
+          <w:rFonts w:ascii="Calibri" w:cs="Calibri" w:eastAsia="Calibri" w:hAnsi="Calibri"/>
+          <w:b/>
+          <w:bCs/>
+          <w:color w:val="E8551F"/>
+          <w:sz w:val="32"/>
+          <w:szCs w:val="32"/>
+        </w:rPr>
+        <w:t xml:space="preserve">11. Deploying the Full Pack as a Single Object (demisto-sdk)</w:t>
+      </w:r>
+    </w:p>
+    <w:p>
+      <w:pPr>
+        <w:spacing w:after="120"/>
+      </w:pPr>
+      <w:r>
+        <w:rPr>
+          <w:rFonts w:ascii="Calibri" w:cs="Calibri" w:eastAsia="Calibri" w:hAnsi="Calibri"/>
+          <w:color w:val="1F2937"/>
+          <w:sz w:val="22"/>
+          <w:szCs w:val="22"/>
+        </w:rPr>
+        <w:t xml:space="preserve">The pack can be delivered to a tenant as one artifact — a pack zip — using Palo Alto Networks' demisto-sdk. This is the recommended path for dev/test tenants and CI pipelines; production tenants normally install from the Marketplace.</w:t>
+      </w:r>
+    </w:p>
+    <w:p>
+      <w:pPr>
+        <w:pStyle w:val="Heading2"/>
+        <w:spacing w:after="120" w:before="280"/>
+      </w:pPr>
+      <w:r>
+        <w:rPr>
+          <w:rFonts w:ascii="Calibri" w:cs="Calibri" w:eastAsia="Calibri" w:hAnsi="Calibri"/>
+          <w:b/>
+          <w:bCs/>
+          <w:color w:val="1F2937"/>
+          <w:sz w:val="26"/>
+          <w:szCs w:val="26"/>
+        </w:rPr>
+        <w:t xml:space="preserve">11.1 One-time setup</w:t>
+      </w:r>
+    </w:p>
+    <w:p>
+      <w:pPr>
+        <w:pStyle w:val="ListParagraph"/>
+        <w:numPr>
+          <w:ilvl w:val="0"/>
+          <w:numId w:val="3"/>
+        </w:numPr>
+        <w:spacing w:after="80"/>
+      </w:pPr>
+      <w:r>
+        <w:rPr>
+          <w:rFonts w:ascii="Calibri" w:cs="Calibri" w:eastAsia="Calibri" w:hAnsi="Calibri"/>
+          <w:b/>
+          <w:bCs/>
+          <w:color w:val="1F2937"/>
+          <w:sz w:val="22"/>
+          <w:szCs w:val="22"/>
+        </w:rPr>
+        <w:t xml:space="preserve">Install the SDK: </w:t>
       </w:r>
       <w:r>
         <w:rPr>
@@ -5319,7 +7432,7 @@
           <w:sz w:val="20"/>
           <w:szCs w:val="20"/>
         </w:rPr>
-        <w:t xml:space="preserve">DEMISTO_BASE_URL</w:t>
+        <w:t xml:space="preserve">pip3 install demisto-sdk</w:t>
       </w:r>
       <w:r>
         <w:rPr>
@@ -5328,7 +7441,58 @@
           <w:sz w:val="22"/>
           <w:szCs w:val="22"/>
         </w:rPr>
-        <w:t xml:space="preserve"> (the api- URL of the tenant), </w:t>
+        <w:t xml:space="preserve"> (1.38+ required — older versions reject packs that declare the platform marketplace).</w:t>
+      </w:r>
+    </w:p>
+    <w:p>
+      <w:pPr>
+        <w:pStyle w:val="ListParagraph"/>
+        <w:numPr>
+          <w:ilvl w:val="0"/>
+          <w:numId w:val="3"/>
+        </w:numPr>
+        <w:spacing w:after="80"/>
+      </w:pPr>
+      <w:r>
+        <w:rPr>
+          <w:rFonts w:ascii="Calibri" w:cs="Calibri" w:eastAsia="Calibri" w:hAnsi="Calibri"/>
+          <w:b/>
+          <w:bCs/>
+          <w:color w:val="1F2937"/>
+          <w:sz w:val="22"/>
+          <w:szCs w:val="22"/>
+        </w:rPr>
+        <w:t xml:space="preserve">Place the pack in a content-repo structure. </w:t>
+      </w:r>
+      <w:r>
+        <w:rPr>
+          <w:rFonts w:ascii="Calibri" w:cs="Calibri" w:eastAsia="Calibri" w:hAnsi="Calibri"/>
+          <w:color w:val="1F2937"/>
+          <w:sz w:val="22"/>
+          <w:szCs w:val="22"/>
+        </w:rPr>
+        <w:t xml:space="preserve">demisto-sdk only runs inside a repo shaped like demisto/content: a git repository containing Packs/Koi/&lt;pack contents&gt;, an empty .private-repo-settings file at the root, and Tests/secrets_white_list.json containing {"iocs":[],"files":[],"generic_strings":[]}.</w:t>
+      </w:r>
+    </w:p>
+    <w:p>
+      <w:pPr>
+        <w:pStyle w:val="ListParagraph"/>
+        <w:numPr>
+          <w:ilvl w:val="0"/>
+          <w:numId w:val="3"/>
+        </w:numPr>
+        <w:spacing w:after="80"/>
+      </w:pPr>
+      <w:r>
+        <w:rPr>
+          <w:rFonts w:ascii="Calibri" w:cs="Calibri" w:eastAsia="Calibri" w:hAnsi="Calibri"/>
+          <w:b/>
+          <w:bCs/>
+          <w:color w:val="1F2937"/>
+          <w:sz w:val="22"/>
+          <w:szCs w:val="22"/>
+        </w:rPr>
+        <w:t xml:space="preserve">Set the connection environment variables: </w:t>
       </w:r>
       <w:r>
         <w:rPr>
@@ -5337,7 +7501,7 @@
           <w:sz w:val="20"/>
           <w:szCs w:val="20"/>
         </w:rPr>
-        <w:t xml:space="preserve">DEMISTO_API_KEY</w:t>
+        <w:t xml:space="preserve">DEMISTO_BASE_URL</w:t>
       </w:r>
       <w:r>
         <w:rPr>
@@ -5346,7 +7510,7 @@
           <w:sz w:val="22"/>
           <w:szCs w:val="22"/>
         </w:rPr>
-        <w:t xml:space="preserve">, and </w:t>
+        <w:t xml:space="preserve"> (the api- URL of the tenant), </w:t>
       </w:r>
       <w:r>
         <w:rPr>
@@ -5355,7 +7519,7 @@
           <w:sz w:val="20"/>
           <w:szCs w:val="20"/>
         </w:rPr>
-        <w:t xml:space="preserve">XSIAM_AUTH_ID</w:t>
+        <w:t xml:space="preserve">DEMISTO_API_KEY</w:t>
       </w:r>
       <w:r>
         <w:rPr>
@@ -5364,6 +7528,24 @@
           <w:sz w:val="22"/>
           <w:szCs w:val="22"/>
         </w:rPr>
+        <w:t xml:space="preserve">, and </w:t>
+      </w:r>
+      <w:r>
+        <w:rPr>
+          <w:rFonts w:ascii="Consolas" w:cs="Consolas" w:eastAsia="Consolas" w:hAnsi="Consolas"/>
+          <w:color w:val="1F2937"/>
+          <w:sz w:val="20"/>
+          <w:szCs w:val="20"/>
+        </w:rPr>
+        <w:t xml:space="preserve">XSIAM_AUTH_ID</w:t>
+      </w:r>
+      <w:r>
+        <w:rPr>
+          <w:rFonts w:ascii="Calibri" w:cs="Calibri" w:eastAsia="Calibri" w:hAnsi="Calibri"/>
+          <w:color w:val="1F2937"/>
+          <w:sz w:val="22"/>
+          <w:szCs w:val="22"/>
+        </w:rPr>
         <w:t xml:space="preserve"> (the key's ID).</w:t>
       </w:r>
     </w:p>
@@ -5381,7 +7563,7 @@
           <w:sz w:val="26"/>
           <w:szCs w:val="26"/>
         </w:rPr>
-        <w:t xml:space="preserve">10.2 Build and push</w:t>
+        <w:t xml:space="preserve">11.2 Build and push</w:t>
       </w:r>
     </w:p>
     <w:p>
@@ -5460,7 +7642,7 @@
           <w:sz w:val="26"/>
           <w:szCs w:val="26"/>
         </w:rPr>
-        <w:t xml:space="preserve">10.3 Notes verified in practice</w:t>
+        <w:t xml:space="preserve">11.3 Notes verified in practice</w:t>
       </w:r>
     </w:p>
     <w:p>
@@ -5564,7 +7746,7 @@
           <w:sz w:val="22"/>
           <w:szCs w:val="22"/>
         </w:rPr>
-        <w:t xml:space="preserve">After upload, the pack appears in the tenant at the new version and every item (integration, playbooks, rules, dashboard) is installed together — see section 12 to validate.</w:t>
+        <w:t xml:space="preserve">After upload, the pack appears in the tenant at the new version and every item (integration, playbooks, rules, dashboard) is installed together — see section 13 to validate.</w:t>
       </w:r>
     </w:p>
     <w:p>
@@ -5581,7 +7763,7 @@
           <w:sz w:val="32"/>
           <w:szCs w:val="32"/>
         </w:rPr>
-        <w:t xml:space="preserve">11. Onboarding Individual Items Manually</w:t>
+        <w:t xml:space="preserve">12. Onboarding Individual Items Manually</w:t>
       </w:r>
     </w:p>
     <w:p>
@@ -5855,7 +8037,7 @@
                 <w:sz w:val="20"/>
                 <w:szCs w:val="20"/>
               </w:rPr>
-              <w:t xml:space="preserve">Settings → Configurations → Object Setup → Lists → New List. Name it exactly "Koi Script Runner", type JSON, and paste the configuration array (section 7 of the playbook README).</w:t>
+              <w:t xml:space="preserve">Settings → Configurations → Object Setup → Lists → New List. Name it exactly "Koi Script Runner", type JSON, and paste the configuration array (section 10.2).</w:t>
             </w:r>
           </w:p>
         </w:tc>
@@ -6074,7 +8256,7 @@
           <w:sz w:val="32"/>
           <w:szCs w:val="32"/>
         </w:rPr>
-        <w:t xml:space="preserve">12. Validating That Everything Works</w:t>
+        <w:t xml:space="preserve">13. Validating That Everything Works</w:t>
       </w:r>
     </w:p>
     <w:p>
@@ -6902,7 +9084,7 @@
           <w:sz w:val="32"/>
           <w:szCs w:val="32"/>
         </w:rPr>
-        <w:t xml:space="preserve">13. Troubleshooting</w:t>
+        <w:t xml:space="preserve">14. Troubleshooting</w:t>
       </w:r>
     </w:p>
     <w:tbl>
@@ -7563,7 +9745,7 @@
           <w:sz w:val="32"/>
           <w:szCs w:val="32"/>
         </w:rPr>
-        <w:t xml:space="preserve">14. Support &amp; References</w:t>
+        <w:t xml:space="preserve">15. Support &amp; References</w:t>
       </w:r>
     </w:p>
     <w:p>

</xml_diff>

<commit_message>
Document name-bound external prerequisites for the Script Runner
The playbooks reference objects strictly by name that the pack does NOT
ship: the KOI script packages (must be uploaded to Action Center with
names matching script.name exactly, or pinned via script.uuid), the
endpoint groups in target.endpoint_groups, the "Koi Script Runner" List
itself, and the optional mail-sender instance. Documented as a
must-pre-exist inventory in the customer guide (new section 10.2),
the repo README, and Playbooks/README.md, including the rename-breaks-
by-name warning.

Co-Authored-By: Claude Fable 5 <noreply@anthropic.com>
</commit_message>
<xml_diff>
--- a/docs/KOI_Integration_Customer_Guide_v1.3.0.docx
+++ b/docs/KOI_Integration_Customer_Guide_v1.3.0.docx
@@ -5561,7 +5561,609 @@
           <w:sz w:val="26"/>
           <w:szCs w:val="26"/>
         </w:rPr>
-        <w:t xml:space="preserve">10.2 Configuration — the "Koi Script Runner" List</w:t>
+        <w:t xml:space="preserve">10.2 What must already exist on the tenant (not shipped in the pack)</w:t>
+      </w:r>
+    </w:p>
+    <w:p>
+      <w:pPr>
+        <w:spacing w:after="120"/>
+      </w:pPr>
+      <w:r>
+        <w:rPr>
+          <w:rFonts w:ascii="Calibri" w:cs="Calibri" w:eastAsia="Calibri" w:hAnsi="Calibri"/>
+          <w:color w:val="1F2937"/>
+          <w:sz w:val="22"/>
+          <w:szCs w:val="22"/>
+        </w:rPr>
+        <w:t xml:space="preserve">The playbooks reference several objects strictly by name at runtime. None of these are delivered by the pack — they must be created on the tenant before the first run, with names that match the configuration exactly (case and spacing included):</w:t>
+      </w:r>
+    </w:p>
+    <w:tbl>
+      <w:tblPr>
+        <w:tblW w:type="dxa" w:w="9360"/>
+        <w:tblBorders>
+          <w:top w:val="single" w:color="auto" w:sz="4"/>
+          <w:left w:val="single" w:color="auto" w:sz="4"/>
+          <w:bottom w:val="single" w:color="auto" w:sz="4"/>
+          <w:right w:val="single" w:color="auto" w:sz="4"/>
+          <w:insideH w:val="single" w:color="auto" w:sz="4"/>
+          <w:insideV w:val="single" w:color="auto" w:sz="4"/>
+        </w:tblBorders>
+      </w:tblPr>
+      <w:tblGrid>
+        <w:gridCol w:w="2700"/>
+        <w:gridCol w:w="2660"/>
+        <w:gridCol w:w="4000"/>
+      </w:tblGrid>
+      <w:tr>
+        <w:trPr>
+          <w:tblHeader/>
+        </w:trPr>
+        <w:tc>
+          <w:tcPr>
+            <w:tcW w:type="dxa" w:w="2700"/>
+            <w:shd w:fill="334155" w:val="clear"/>
+            <w:tcMar>
+              <w:top w:type="dxa" w:w="60"/>
+              <w:left w:type="dxa" w:w="100"/>
+              <w:bottom w:type="dxa" w:w="60"/>
+              <w:right w:type="dxa" w:w="100"/>
+            </w:tcMar>
+            <w:vAlign w:val="center"/>
+          </w:tcPr>
+          <w:p>
+            <w:pPr>
+              <w:spacing w:after="0"/>
+            </w:pPr>
+            <w:r>
+              <w:rPr>
+                <w:rFonts w:ascii="Calibri" w:cs="Calibri" w:eastAsia="Calibri" w:hAnsi="Calibri"/>
+                <w:b/>
+                <w:bCs/>
+                <w:color w:val="FFFFFF"/>
+                <w:sz w:val="21"/>
+                <w:szCs w:val="21"/>
+              </w:rPr>
+              <w:t xml:space="preserve">Dependency</w:t>
+            </w:r>
+          </w:p>
+        </w:tc>
+        <w:tc>
+          <w:tcPr>
+            <w:tcW w:type="dxa" w:w="2660"/>
+            <w:shd w:fill="334155" w:val="clear"/>
+            <w:tcMar>
+              <w:top w:type="dxa" w:w="60"/>
+              <w:left w:type="dxa" w:w="100"/>
+              <w:bottom w:type="dxa" w:w="60"/>
+              <w:right w:type="dxa" w:w="100"/>
+            </w:tcMar>
+            <w:vAlign w:val="center"/>
+          </w:tcPr>
+          <w:p>
+            <w:pPr>
+              <w:spacing w:after="0"/>
+            </w:pPr>
+            <w:r>
+              <w:rPr>
+                <w:rFonts w:ascii="Calibri" w:cs="Calibri" w:eastAsia="Calibri" w:hAnsi="Calibri"/>
+                <w:b/>
+                <w:bCs/>
+                <w:color w:val="FFFFFF"/>
+                <w:sz w:val="21"/>
+                <w:szCs w:val="21"/>
+              </w:rPr>
+              <w:t xml:space="preserve">Where it lives</w:t>
+            </w:r>
+          </w:p>
+        </w:tc>
+        <w:tc>
+          <w:tcPr>
+            <w:tcW w:type="dxa" w:w="4000"/>
+            <w:shd w:fill="334155" w:val="clear"/>
+            <w:tcMar>
+              <w:top w:type="dxa" w:w="60"/>
+              <w:left w:type="dxa" w:w="100"/>
+              <w:bottom w:type="dxa" w:w="60"/>
+              <w:right w:type="dxa" w:w="100"/>
+            </w:tcMar>
+            <w:vAlign w:val="center"/>
+          </w:tcPr>
+          <w:p>
+            <w:pPr>
+              <w:spacing w:after="0"/>
+            </w:pPr>
+            <w:r>
+              <w:rPr>
+                <w:rFonts w:ascii="Calibri" w:cs="Calibri" w:eastAsia="Calibri" w:hAnsi="Calibri"/>
+                <w:b/>
+                <w:bCs/>
+                <w:color w:val="FFFFFF"/>
+                <w:sz w:val="21"/>
+                <w:szCs w:val="21"/>
+              </w:rPr>
+              <w:t xml:space="preserve">Requirement</w:t>
+            </w:r>
+          </w:p>
+        </w:tc>
+      </w:tr>
+      <w:tr>
+        <w:trPr>
+          <w:tblHeader w:val="false"/>
+        </w:trPr>
+        <w:tc>
+          <w:tcPr>
+            <w:tcW w:type="dxa" w:w="2700"/>
+            <w:tcMar>
+              <w:top w:type="dxa" w:w="60"/>
+              <w:left w:type="dxa" w:w="100"/>
+              <w:bottom w:type="dxa" w:w="60"/>
+              <w:right w:type="dxa" w:w="100"/>
+            </w:tcMar>
+            <w:vAlign w:val="center"/>
+          </w:tcPr>
+          <w:p>
+            <w:pPr>
+              <w:spacing w:after="0"/>
+            </w:pPr>
+            <w:r>
+              <w:rPr>
+                <w:rFonts w:ascii="Calibri" w:cs="Calibri" w:eastAsia="Calibri" w:hAnsi="Calibri"/>
+                <w:b w:val="false"/>
+                <w:bCs w:val="false"/>
+                <w:color w:val="1F2937"/>
+                <w:sz w:val="20"/>
+                <w:szCs w:val="20"/>
+              </w:rPr>
+              <w:t xml:space="preserve">KOI script package(s)</w:t>
+            </w:r>
+          </w:p>
+        </w:tc>
+        <w:tc>
+          <w:tcPr>
+            <w:tcW w:type="dxa" w:w="2660"/>
+            <w:tcMar>
+              <w:top w:type="dxa" w:w="60"/>
+              <w:left w:type="dxa" w:w="100"/>
+              <w:bottom w:type="dxa" w:w="60"/>
+              <w:right w:type="dxa" w:w="100"/>
+            </w:tcMar>
+            <w:vAlign w:val="center"/>
+          </w:tcPr>
+          <w:p>
+            <w:pPr>
+              <w:spacing w:after="0"/>
+            </w:pPr>
+            <w:r>
+              <w:rPr>
+                <w:rFonts w:ascii="Calibri" w:cs="Calibri" w:eastAsia="Calibri" w:hAnsi="Calibri"/>
+                <w:b w:val="false"/>
+                <w:bCs w:val="false"/>
+                <w:color w:val="1F2937"/>
+                <w:sz w:val="20"/>
+                <w:szCs w:val="20"/>
+              </w:rPr>
+              <w:t xml:space="preserve">Action Center → Scripts Library</w:t>
+            </w:r>
+          </w:p>
+        </w:tc>
+        <w:tc>
+          <w:tcPr>
+            <w:tcW w:type="dxa" w:w="4000"/>
+            <w:tcMar>
+              <w:top w:type="dxa" w:w="60"/>
+              <w:left w:type="dxa" w:w="100"/>
+              <w:bottom w:type="dxa" w:w="60"/>
+              <w:right w:type="dxa" w:w="100"/>
+            </w:tcMar>
+            <w:vAlign w:val="center"/>
+          </w:tcPr>
+          <w:p>
+            <w:pPr>
+              <w:spacing w:after="0"/>
+            </w:pPr>
+            <w:r>
+              <w:rPr>
+                <w:rFonts w:ascii="Calibri" w:cs="Calibri" w:eastAsia="Calibri" w:hAnsi="Calibri"/>
+                <w:b w:val="false"/>
+                <w:bCs w:val="false"/>
+                <w:color w:val="1F2937"/>
+                <w:sz w:val="20"/>
+                <w:szCs w:val="20"/>
+              </w:rPr>
+              <w:t xml:space="preserve">Upload the KOI deployment script(s) yourself — they are NOT part of this pack. The Library name must match the List's script.name exactly (e.g., "KOI Deployment Script - Windows"). To make the reference rename-proof, pin script.uuid instead.</w:t>
+            </w:r>
+          </w:p>
+        </w:tc>
+      </w:tr>
+      <w:tr>
+        <w:trPr>
+          <w:tblHeader w:val="false"/>
+        </w:trPr>
+        <w:tc>
+          <w:tcPr>
+            <w:tcW w:type="dxa" w:w="2700"/>
+            <w:tcMar>
+              <w:top w:type="dxa" w:w="60"/>
+              <w:left w:type="dxa" w:w="100"/>
+              <w:bottom w:type="dxa" w:w="60"/>
+              <w:right w:type="dxa" w:w="100"/>
+            </w:tcMar>
+            <w:vAlign w:val="center"/>
+          </w:tcPr>
+          <w:p>
+            <w:pPr>
+              <w:spacing w:after="0"/>
+            </w:pPr>
+            <w:r>
+              <w:rPr>
+                <w:rFonts w:ascii="Calibri" w:cs="Calibri" w:eastAsia="Calibri" w:hAnsi="Calibri"/>
+                <w:b w:val="false"/>
+                <w:bCs w:val="false"/>
+                <w:color w:val="1F2937"/>
+                <w:sz w:val="20"/>
+                <w:szCs w:val="20"/>
+              </w:rPr>
+              <w:t xml:space="preserve">Endpoint group(s)</w:t>
+            </w:r>
+          </w:p>
+        </w:tc>
+        <w:tc>
+          <w:tcPr>
+            <w:tcW w:type="dxa" w:w="2660"/>
+            <w:tcMar>
+              <w:top w:type="dxa" w:w="60"/>
+              <w:left w:type="dxa" w:w="100"/>
+              <w:bottom w:type="dxa" w:w="60"/>
+              <w:right w:type="dxa" w:w="100"/>
+            </w:tcMar>
+            <w:vAlign w:val="center"/>
+          </w:tcPr>
+          <w:p>
+            <w:pPr>
+              <w:spacing w:after="0"/>
+            </w:pPr>
+            <w:r>
+              <w:rPr>
+                <w:rFonts w:ascii="Calibri" w:cs="Calibri" w:eastAsia="Calibri" w:hAnsi="Calibri"/>
+                <w:b w:val="false"/>
+                <w:bCs w:val="false"/>
+                <w:color w:val="1F2937"/>
+                <w:sz w:val="20"/>
+                <w:szCs w:val="20"/>
+              </w:rPr>
+              <w:t xml:space="preserve">Endpoints → Endpoint Groups</w:t>
+            </w:r>
+          </w:p>
+        </w:tc>
+        <w:tc>
+          <w:tcPr>
+            <w:tcW w:type="dxa" w:w="4000"/>
+            <w:tcMar>
+              <w:top w:type="dxa" w:w="60"/>
+              <w:left w:type="dxa" w:w="100"/>
+              <w:bottom w:type="dxa" w:w="60"/>
+              <w:right w:type="dxa" w:w="100"/>
+            </w:tcMar>
+            <w:vAlign w:val="center"/>
+          </w:tcPr>
+          <w:p>
+            <w:pPr>
+              <w:spacing w:after="0"/>
+            </w:pPr>
+            <w:r>
+              <w:rPr>
+                <w:rFonts w:ascii="Calibri" w:cs="Calibri" w:eastAsia="Calibri" w:hAnsi="Calibri"/>
+                <w:b w:val="false"/>
+                <w:bCs w:val="false"/>
+                <w:color w:val="1F2937"/>
+                <w:sz w:val="20"/>
+                <w:szCs w:val="20"/>
+              </w:rPr>
+              <w:t xml:space="preserve">Every group named in target.endpoint_groups must exist and contain the intended agents. Alternatively, scope by target.endpoint_hostnames.</w:t>
+            </w:r>
+          </w:p>
+        </w:tc>
+      </w:tr>
+      <w:tr>
+        <w:trPr>
+          <w:tblHeader w:val="false"/>
+        </w:trPr>
+        <w:tc>
+          <w:tcPr>
+            <w:tcW w:type="dxa" w:w="2700"/>
+            <w:tcMar>
+              <w:top w:type="dxa" w:w="60"/>
+              <w:left w:type="dxa" w:w="100"/>
+              <w:bottom w:type="dxa" w:w="60"/>
+              <w:right w:type="dxa" w:w="100"/>
+            </w:tcMar>
+            <w:vAlign w:val="center"/>
+          </w:tcPr>
+          <w:p>
+            <w:pPr>
+              <w:spacing w:after="0"/>
+            </w:pPr>
+            <w:r>
+              <w:rPr>
+                <w:rFonts w:ascii="Calibri" w:cs="Calibri" w:eastAsia="Calibri" w:hAnsi="Calibri"/>
+                <w:b w:val="false"/>
+                <w:bCs w:val="false"/>
+                <w:color w:val="1F2937"/>
+                <w:sz w:val="20"/>
+                <w:szCs w:val="20"/>
+              </w:rPr>
+              <w:t xml:space="preserve">Target agents</w:t>
+            </w:r>
+          </w:p>
+        </w:tc>
+        <w:tc>
+          <w:tcPr>
+            <w:tcW w:type="dxa" w:w="2660"/>
+            <w:tcMar>
+              <w:top w:type="dxa" w:w="60"/>
+              <w:left w:type="dxa" w:w="100"/>
+              <w:bottom w:type="dxa" w:w="60"/>
+              <w:right w:type="dxa" w:w="100"/>
+            </w:tcMar>
+            <w:vAlign w:val="center"/>
+          </w:tcPr>
+          <w:p>
+            <w:pPr>
+              <w:spacing w:after="0"/>
+            </w:pPr>
+            <w:r>
+              <w:rPr>
+                <w:rFonts w:ascii="Calibri" w:cs="Calibri" w:eastAsia="Calibri" w:hAnsi="Calibri"/>
+                <w:b w:val="false"/>
+                <w:bCs w:val="false"/>
+                <w:color w:val="1F2937"/>
+                <w:sz w:val="20"/>
+                <w:szCs w:val="20"/>
+              </w:rPr>
+              <w:t xml:space="preserve">Endpoints</w:t>
+            </w:r>
+          </w:p>
+        </w:tc>
+        <w:tc>
+          <w:tcPr>
+            <w:tcW w:type="dxa" w:w="4000"/>
+            <w:tcMar>
+              <w:top w:type="dxa" w:w="60"/>
+              <w:left w:type="dxa" w:w="100"/>
+              <w:bottom w:type="dxa" w:w="60"/>
+              <w:right w:type="dxa" w:w="100"/>
+            </w:tcMar>
+            <w:vAlign w:val="center"/>
+          </w:tcPr>
+          <w:p>
+            <w:pPr>
+              <w:spacing w:after="0"/>
+            </w:pPr>
+            <w:r>
+              <w:rPr>
+                <w:rFonts w:ascii="Calibri" w:cs="Calibri" w:eastAsia="Calibri" w:hAnsi="Calibri"/>
+                <w:b w:val="false"/>
+                <w:bCs w:val="false"/>
+                <w:color w:val="1F2937"/>
+                <w:sz w:val="20"/>
+                <w:szCs w:val="20"/>
+              </w:rPr>
+              <w:t xml:space="preserve">Cortex agents installed on the targets, CONNECTED and not isolated, with an OS matching the entry's endpoint_os — otherwise the entry reports skipped.</w:t>
+            </w:r>
+          </w:p>
+        </w:tc>
+      </w:tr>
+      <w:tr>
+        <w:trPr>
+          <w:tblHeader w:val="false"/>
+        </w:trPr>
+        <w:tc>
+          <w:tcPr>
+            <w:tcW w:type="dxa" w:w="2700"/>
+            <w:tcMar>
+              <w:top w:type="dxa" w:w="60"/>
+              <w:left w:type="dxa" w:w="100"/>
+              <w:bottom w:type="dxa" w:w="60"/>
+              <w:right w:type="dxa" w:w="100"/>
+            </w:tcMar>
+            <w:vAlign w:val="center"/>
+          </w:tcPr>
+          <w:p>
+            <w:pPr>
+              <w:spacing w:after="0"/>
+            </w:pPr>
+            <w:r>
+              <w:rPr>
+                <w:rFonts w:ascii="Calibri" w:cs="Calibri" w:eastAsia="Calibri" w:hAnsi="Calibri"/>
+                <w:b w:val="false"/>
+                <w:bCs w:val="false"/>
+                <w:color w:val="1F2937"/>
+                <w:sz w:val="20"/>
+                <w:szCs w:val="20"/>
+              </w:rPr>
+              <w:t xml:space="preserve">Configuration List</w:t>
+            </w:r>
+          </w:p>
+        </w:tc>
+        <w:tc>
+          <w:tcPr>
+            <w:tcW w:type="dxa" w:w="2660"/>
+            <w:tcMar>
+              <w:top w:type="dxa" w:w="60"/>
+              <w:left w:type="dxa" w:w="100"/>
+              <w:bottom w:type="dxa" w:w="60"/>
+              <w:right w:type="dxa" w:w="100"/>
+            </w:tcMar>
+            <w:vAlign w:val="center"/>
+          </w:tcPr>
+          <w:p>
+            <w:pPr>
+              <w:spacing w:after="0"/>
+            </w:pPr>
+            <w:r>
+              <w:rPr>
+                <w:rFonts w:ascii="Calibri" w:cs="Calibri" w:eastAsia="Calibri" w:hAnsi="Calibri"/>
+                <w:b w:val="false"/>
+                <w:bCs w:val="false"/>
+                <w:color w:val="1F2937"/>
+                <w:sz w:val="20"/>
+                <w:szCs w:val="20"/>
+              </w:rPr>
+              <w:t xml:space="preserve">Settings → Object Setup → Lists</w:t>
+            </w:r>
+          </w:p>
+        </w:tc>
+        <w:tc>
+          <w:tcPr>
+            <w:tcW w:type="dxa" w:w="4000"/>
+            <w:tcMar>
+              <w:top w:type="dxa" w:w="60"/>
+              <w:left w:type="dxa" w:w="100"/>
+              <w:bottom w:type="dxa" w:w="60"/>
+              <w:right w:type="dxa" w:w="100"/>
+            </w:tcMar>
+            <w:vAlign w:val="center"/>
+          </w:tcPr>
+          <w:p>
+            <w:pPr>
+              <w:spacing w:after="0"/>
+            </w:pPr>
+            <w:r>
+              <w:rPr>
+                <w:rFonts w:ascii="Calibri" w:cs="Calibri" w:eastAsia="Calibri" w:hAnsi="Calibri"/>
+                <w:b w:val="false"/>
+                <w:bCs w:val="false"/>
+                <w:color w:val="1F2937"/>
+                <w:sz w:val="20"/>
+                <w:szCs w:val="20"/>
+              </w:rPr>
+              <w:t xml:space="preserve">A JSON List named exactly "Koi Script Runner" (section 10.3).</w:t>
+            </w:r>
+          </w:p>
+        </w:tc>
+      </w:tr>
+      <w:tr>
+        <w:trPr>
+          <w:tblHeader w:val="false"/>
+        </w:trPr>
+        <w:tc>
+          <w:tcPr>
+            <w:tcW w:type="dxa" w:w="2700"/>
+            <w:tcMar>
+              <w:top w:type="dxa" w:w="60"/>
+              <w:left w:type="dxa" w:w="100"/>
+              <w:bottom w:type="dxa" w:w="60"/>
+              <w:right w:type="dxa" w:w="100"/>
+            </w:tcMar>
+            <w:vAlign w:val="center"/>
+          </w:tcPr>
+          <w:p>
+            <w:pPr>
+              <w:spacing w:after="0"/>
+            </w:pPr>
+            <w:r>
+              <w:rPr>
+                <w:rFonts w:ascii="Calibri" w:cs="Calibri" w:eastAsia="Calibri" w:hAnsi="Calibri"/>
+                <w:b w:val="false"/>
+                <w:bCs w:val="false"/>
+                <w:color w:val="1F2937"/>
+                <w:sz w:val="20"/>
+                <w:szCs w:val="20"/>
+              </w:rPr>
+              <w:t xml:space="preserve">Mail-sender instance (optional)</w:t>
+            </w:r>
+          </w:p>
+        </w:tc>
+        <w:tc>
+          <w:tcPr>
+            <w:tcW w:type="dxa" w:w="2660"/>
+            <w:tcMar>
+              <w:top w:type="dxa" w:w="60"/>
+              <w:left w:type="dxa" w:w="100"/>
+              <w:bottom w:type="dxa" w:w="60"/>
+              <w:right w:type="dxa" w:w="100"/>
+            </w:tcMar>
+            <w:vAlign w:val="center"/>
+          </w:tcPr>
+          <w:p>
+            <w:pPr>
+              <w:spacing w:after="0"/>
+            </w:pPr>
+            <w:r>
+              <w:rPr>
+                <w:rFonts w:ascii="Calibri" w:cs="Calibri" w:eastAsia="Calibri" w:hAnsi="Calibri"/>
+                <w:b w:val="false"/>
+                <w:bCs w:val="false"/>
+                <w:color w:val="1F2937"/>
+                <w:sz w:val="20"/>
+                <w:szCs w:val="20"/>
+              </w:rPr>
+              <w:t xml:space="preserve">Automation &amp; Feed Integrations</w:t>
+            </w:r>
+          </w:p>
+        </w:tc>
+        <w:tc>
+          <w:tcPr>
+            <w:tcW w:type="dxa" w:w="4000"/>
+            <w:tcMar>
+              <w:top w:type="dxa" w:w="60"/>
+              <w:left w:type="dxa" w:w="100"/>
+              <w:bottom w:type="dxa" w:w="60"/>
+              <w:right w:type="dxa" w:w="100"/>
+            </w:tcMar>
+            <w:vAlign w:val="center"/>
+          </w:tcPr>
+          <w:p>
+            <w:pPr>
+              <w:spacing w:after="0"/>
+            </w:pPr>
+            <w:r>
+              <w:rPr>
+                <w:rFonts w:ascii="Calibri" w:cs="Calibri" w:eastAsia="Calibri" w:hAnsi="Calibri"/>
+                <w:b w:val="false"/>
+                <w:bCs w:val="false"/>
+                <w:color w:val="1F2937"/>
+                <w:sz w:val="20"/>
+                <w:szCs w:val="20"/>
+              </w:rPr>
+              <w:t xml:space="preserve">Required only when notifications are configured: an enabled instance that supports send-mail. If notification.sendmail_instance.name is set, an instance with that exact name must exist.</w:t>
+            </w:r>
+          </w:p>
+        </w:tc>
+      </w:tr>
+    </w:tbl>
+    <w:p>
+      <w:pPr>
+        <w:spacing w:after="120"/>
+      </w:pPr>
+      <w:r>
+        <w:rPr>
+          <w:rFonts w:ascii="Calibri" w:cs="Calibri" w:eastAsia="Calibri" w:hAnsi="Calibri"/>
+          <w:i/>
+          <w:iCs/>
+          <w:color w:val="6B7280"/>
+          <w:sz w:val="22"/>
+          <w:szCs w:val="22"/>
+        </w:rPr>
+        <w:t xml:space="preserve">Everything binds by name at run time: renaming a script in Action Center, an endpoint group, the List, or a mail instance — without updating the List configuration — causes the next run to fail or skip (the war-room reason states which reference broke).</w:t>
+      </w:r>
+    </w:p>
+    <w:p>
+      <w:pPr>
+        <w:pStyle w:val="Heading2"/>
+        <w:spacing w:after="120" w:before="280"/>
+      </w:pPr>
+      <w:r>
+        <w:rPr>
+          <w:rFonts w:ascii="Calibri" w:cs="Calibri" w:eastAsia="Calibri" w:hAnsi="Calibri"/>
+          <w:b/>
+          <w:bCs/>
+          <w:color w:val="1F2937"/>
+          <w:sz w:val="26"/>
+          <w:szCs w:val="26"/>
+        </w:rPr>
+        <w:t xml:space="preserve">10.3 Configuration — the "Koi Script Runner" List</w:t>
       </w:r>
     </w:p>
     <w:p>
@@ -6832,7 +7434,7 @@
           <w:sz w:val="26"/>
           <w:szCs w:val="26"/>
         </w:rPr>
-        <w:t xml:space="preserve">10.3 How scripts are matched to endpoints</w:t>
+        <w:t xml:space="preserve">10.4 How scripts are matched to endpoints</w:t>
       </w:r>
     </w:p>
     <w:p>
@@ -6863,7 +7465,7 @@
           <w:sz w:val="26"/>
           <w:szCs w:val="26"/>
         </w:rPr>
-        <w:t xml:space="preserve">10.4 Job setup</w:t>
+        <w:t xml:space="preserve">10.5 Job setup</w:t>
       </w:r>
     </w:p>
     <w:p>
@@ -6977,7 +7579,7 @@
           <w:sz w:val="26"/>
           <w:szCs w:val="26"/>
         </w:rPr>
-        <w:t xml:space="preserve">10.5 Run outcomes</w:t>
+        <w:t xml:space="preserve">10.6 Run outcomes</w:t>
       </w:r>
     </w:p>
     <w:tbl>
@@ -8037,7 +8639,7 @@
                 <w:sz w:val="20"/>
                 <w:szCs w:val="20"/>
               </w:rPr>
-              <w:t xml:space="preserve">Settings → Configurations → Object Setup → Lists → New List. Name it exactly "Koi Script Runner", type JSON, and paste the configuration array (section 10.2).</w:t>
+              <w:t xml:space="preserve">Settings → Configurations → Object Setup → Lists → New List. Name it exactly "Koi Script Runner", type JSON, and paste the configuration array (section 10.3).</w:t>
             </w:r>
           </w:p>
         </w:tc>

</xml_diff>